<commit_message>
feat: add DOCX generation support and merge converter into single script
</commit_message>
<xml_diff>
--- a/Resume/Prabhash Thakur Resume.docx
+++ b/Resume/Prabhash Thakur Resume.docx
@@ -4,41 +4,40 @@
   <w:body>
     <w:p>
       <w:pPr>
-        <w:jc w:val="center"/>
+        <w:spacing w:before="0" w:after="0"/>
       </w:pPr>
       <w:r>
         <w:rPr>
           <w:rFonts w:ascii="Calibri" w:hAnsi="Calibri"/>
           <w:b/>
-          <w:color w:val="1A1A1A"/>
-          <w:sz w:val="44"/>
+          <w:color w:val="111111"/>
+          <w:sz w:val="48"/>
         </w:rPr>
         <w:t>Prabhash Thakur</w:t>
       </w:r>
     </w:p>
     <w:p>
       <w:pPr>
-        <w:jc w:val="center"/>
+        <w:spacing w:before="0" w:after="40"/>
       </w:pPr>
       <w:r>
         <w:rPr>
           <w:rFonts w:ascii="Calibri" w:hAnsi="Calibri"/>
-          <w:b w:val="0"/>
-          <w:color w:val="2196F3"/>
-          <w:sz w:val="20"/>
+          <w:b/>
+          <w:color w:val="16325C"/>
+          <w:sz w:val="23"/>
         </w:rPr>
         <w:t>Senior Lead Engineer</w:t>
       </w:r>
     </w:p>
     <w:p>
       <w:pPr>
-        <w:jc w:val="center"/>
+        <w:spacing w:before="0" w:after="40"/>
       </w:pPr>
       <w:r>
         <w:rPr>
           <w:rFonts w:ascii="Calibri" w:hAnsi="Calibri"/>
-          <w:b w:val="0"/>
-          <w:color w:val="444444"/>
+          <w:color w:val="2B2B2B"/>
           <w:sz w:val="18"/>
         </w:rPr>
         <w:t>+91 8759480218 | thakurprabhash80@gmail.com | linkedin.com/in/imprabhash</w:t>
@@ -46,38 +45,38 @@
     </w:p>
     <w:p>
       <w:pPr>
-        <w:jc w:val="center"/>
+        <w:spacing w:before="80" w:after="80"/>
       </w:pPr>
       <w:r>
         <w:rPr>
-          <w:rFonts w:ascii="Calibri" w:hAnsi="Calibri"/>
-          <w:b w:val="0"/>
-          <w:color w:val="888888"/>
-          <w:sz w:val="14"/>
+          <w:color w:val="CFCFCF"/>
+          <w:sz w:val="12"/>
         </w:rPr>
         <w:t>────────────────────────────────────────────────────────────────────────────────</w:t>
       </w:r>
     </w:p>
     <w:p>
+      <w:pPr>
+        <w:spacing w:before="40" w:after="80"/>
+      </w:pPr>
       <w:r>
         <w:rPr>
           <w:rFonts w:ascii="Calibri" w:hAnsi="Calibri"/>
           <w:b/>
-          <w:color w:val="2D2D2D"/>
-          <w:sz w:val="20"/>
+          <w:color w:val="16325C"/>
+          <w:sz w:val="22"/>
         </w:rPr>
         <w:t>PROFESSIONAL SUMMARY</w:t>
       </w:r>
     </w:p>
     <w:p>
       <w:pPr>
-        <w:ind w:left="0" w:firstLine="0"/>
+        <w:spacing w:before="0" w:after="40" w:line="280" w:lineRule="exact"/>
       </w:pPr>
       <w:r>
         <w:rPr>
           <w:rFonts w:ascii="Calibri" w:hAnsi="Calibri"/>
-          <w:b w:val="0"/>
-          <w:color w:val="444444"/>
+          <w:color w:val="2B2B2B"/>
           <w:sz w:val="19"/>
         </w:rPr>
         <w:t>Data engineer with 8+ years on Snowflake and dbt, currently leading a team of 8 at KIPI.AI building a Data Mesh and Gen AI data products with Snowflake Cortex. Recent work covers RAG applications over unstructured data (PDFs, DOCX, audio transcripts) using Cortex Search, self-service analytics through Cortex Analyst, and LLM-driven enrichment pipelines with Cortex functions. Comfortable picking the right modelling approach for the problem (Data Vault, star schema, medallion), locking down access with RBAC and masking policies, and keeping Snowflake compute costs under control. Also handle architecture decisions and work directly with client stakeholders on scope and delivery. SnowPro Advanced Architect, SnowPro Advanced Engineer, SnowPro Core, and dbt Developer certified.</w:t>
@@ -85,56 +84,190 @@
     </w:p>
     <w:p>
       <w:pPr>
-        <w:jc w:val="center"/>
+        <w:spacing w:before="80" w:after="80"/>
       </w:pPr>
       <w:r>
         <w:rPr>
-          <w:rFonts w:ascii="Calibri" w:hAnsi="Calibri"/>
-          <w:b w:val="0"/>
-          <w:color w:val="888888"/>
-          <w:sz w:val="14"/>
+          <w:color w:val="CFCFCF"/>
+          <w:sz w:val="12"/>
         </w:rPr>
         <w:t>────────────────────────────────────────────────────────────────────────────────</w:t>
       </w:r>
     </w:p>
     <w:p>
+      <w:pPr>
+        <w:spacing w:before="40" w:after="80"/>
+      </w:pPr>
       <w:r>
         <w:rPr>
           <w:rFonts w:ascii="Calibri" w:hAnsi="Calibri"/>
           <w:b/>
-          <w:color w:val="2D2D2D"/>
-          <w:sz w:val="20"/>
+          <w:color w:val="16325C"/>
+          <w:sz w:val="22"/>
+        </w:rPr>
+        <w:t>SKILLS</w:t>
+      </w:r>
+    </w:p>
+    <w:p>
+      <w:pPr>
+        <w:spacing w:before="0" w:after="40" w:line="280" w:lineRule="exact"/>
+      </w:pPr>
+      <w:r>
+        <w:rPr>
+          <w:rFonts w:ascii="Calibri" w:hAnsi="Calibri"/>
+          <w:b/>
+          <w:color w:val="111111"/>
+          <w:sz w:val="19"/>
+        </w:rPr>
+        <w:t xml:space="preserve">Data Platform &amp; Engineering: </w:t>
+      </w:r>
+      <w:r>
+        <w:rPr>
+          <w:rFonts w:ascii="Calibri" w:hAnsi="Calibri"/>
+          <w:color w:val="2B2B2B"/>
+          <w:sz w:val="19"/>
+        </w:rPr>
+        <w:t>Snowflake, dbt, SQL, Python, Azure Data Factory, Databricks, Azure Data Lake, AWS S3, Airflow, Jinja, ETL/ELT Pipeline Design, Data Warehouse Architecture</w:t>
+      </w:r>
+    </w:p>
+    <w:p>
+      <w:pPr>
+        <w:spacing w:before="0" w:after="40" w:line="280" w:lineRule="exact"/>
+      </w:pPr>
+      <w:r>
+        <w:rPr>
+          <w:rFonts w:ascii="Calibri" w:hAnsi="Calibri"/>
+          <w:b/>
+          <w:color w:val="111111"/>
+          <w:sz w:val="19"/>
+        </w:rPr>
+        <w:t xml:space="preserve">Snowflake AI &amp; Gen AI: </w:t>
+      </w:r>
+      <w:r>
+        <w:rPr>
+          <w:rFonts w:ascii="Calibri" w:hAnsi="Calibri"/>
+          <w:color w:val="2B2B2B"/>
+          <w:sz w:val="19"/>
+        </w:rPr>
+        <w:t>Cortex COMPLETE, CLASSIFY_TEXT, EXTRACT_ANSWER, SENTIMENT, SUMMARIZE, TRANSLATE, AI_PARSE_DOCUMENT, Cortex Search (RAG), Cortex Analyst, Cortex Fine-Tuning, Document AI, Streamlit in Snowflake, Unstructured Data (PDF, DOCX, Audio)</w:t>
+      </w:r>
+    </w:p>
+    <w:p>
+      <w:pPr>
+        <w:spacing w:before="0" w:after="40" w:line="280" w:lineRule="exact"/>
+      </w:pPr>
+      <w:r>
+        <w:rPr>
+          <w:rFonts w:ascii="Calibri" w:hAnsi="Calibri"/>
+          <w:b/>
+          <w:color w:val="111111"/>
+          <w:sz w:val="19"/>
+        </w:rPr>
+        <w:t xml:space="preserve">Architecture &amp; Governance: </w:t>
+      </w:r>
+      <w:r>
+        <w:rPr>
+          <w:rFonts w:ascii="Calibri" w:hAnsi="Calibri"/>
+          <w:color w:val="2B2B2B"/>
+          <w:sz w:val="19"/>
+        </w:rPr>
+        <w:t>Data Mesh, Medallion Architecture, Data Vault Modeling, Dimensional Modeling, Star Schema, Data Quality Frameworks, dbt-expectations, Row-Level Security, RBAC, Dynamic Data Masking, Data Lineage, CI/CD for dbt, Azure DevOps, Git</w:t>
+      </w:r>
+    </w:p>
+    <w:p>
+      <w:pPr>
+        <w:spacing w:before="0" w:after="40" w:line="280" w:lineRule="exact"/>
+      </w:pPr>
+      <w:r>
+        <w:rPr>
+          <w:rFonts w:ascii="Calibri" w:hAnsi="Calibri"/>
+          <w:b/>
+          <w:color w:val="111111"/>
+          <w:sz w:val="19"/>
+        </w:rPr>
+        <w:t xml:space="preserve">Reporting &amp; Automation: </w:t>
+      </w:r>
+      <w:r>
+        <w:rPr>
+          <w:rFonts w:ascii="Calibri" w:hAnsi="Calibri"/>
+          <w:color w:val="2B2B2B"/>
+          <w:sz w:val="19"/>
+        </w:rPr>
+        <w:t>Power BI, DAX, M Query, Power Automate, PowerApps, Azure Logic Apps, Azure Functions, SAP BW, SAP HANA</w:t>
+      </w:r>
+    </w:p>
+    <w:p>
+      <w:pPr>
+        <w:spacing w:before="0" w:after="40" w:line="280" w:lineRule="exact"/>
+      </w:pPr>
+      <w:r>
+        <w:rPr>
+          <w:rFonts w:ascii="Calibri" w:hAnsi="Calibri"/>
+          <w:b/>
+          <w:color w:val="111111"/>
+          <w:sz w:val="19"/>
+        </w:rPr>
+        <w:t xml:space="preserve">Leadership &amp; Delivery: </w:t>
+      </w:r>
+      <w:r>
+        <w:rPr>
+          <w:rFonts w:ascii="Calibri" w:hAnsi="Calibri"/>
+          <w:color w:val="2B2B2B"/>
+          <w:sz w:val="19"/>
+        </w:rPr>
+        <w:t>Team Leadership (8+ engineers), Mentorship, Stakeholder Management, Sprint Planning, Delivery Planning, Cross-Functional Governance</w:t>
+      </w:r>
+    </w:p>
+    <w:p>
+      <w:pPr>
+        <w:spacing w:before="80" w:after="80"/>
+      </w:pPr>
+      <w:r>
+        <w:rPr>
+          <w:color w:val="CFCFCF"/>
+          <w:sz w:val="12"/>
+        </w:rPr>
+        <w:t>────────────────────────────────────────────────────────────────────────────────</w:t>
+      </w:r>
+    </w:p>
+    <w:p>
+      <w:pPr>
+        <w:spacing w:before="40" w:after="80"/>
+      </w:pPr>
+      <w:r>
+        <w:rPr>
+          <w:rFonts w:ascii="Calibri" w:hAnsi="Calibri"/>
+          <w:b/>
+          <w:color w:val="16325C"/>
+          <w:sz w:val="22"/>
         </w:rPr>
         <w:t>WORK EXPERIENCE</w:t>
       </w:r>
     </w:p>
     <w:p>
+      <w:pPr>
+        <w:spacing w:before="120" w:after="0"/>
+      </w:pPr>
       <w:r>
         <w:rPr>
           <w:rFonts w:ascii="Calibri" w:hAnsi="Calibri"/>
           <w:b/>
-          <w:color w:val="1A1A1A"/>
-          <w:sz w:val="22"/>
+          <w:color w:val="111111"/>
+          <w:sz w:val="21"/>
         </w:rPr>
-        <w:t>Senior Lead Engineer</w:t>
+        <w:t>Senior Lead Engineer  |  July 2025 - Present</w:t>
       </w:r>
+    </w:p>
+    <w:p>
+      <w:pPr>
+        <w:spacing w:before="0" w:after="40"/>
+      </w:pPr>
       <w:r>
         <w:rPr>
           <w:rFonts w:ascii="Calibri" w:hAnsi="Calibri"/>
-          <w:b w:val="0"/>
-          <w:color w:val="777777"/>
-          <w:sz w:val="18"/>
-        </w:rPr>
-        <w:t xml:space="preserve">  |  July 2025 - Present</w:t>
-      </w:r>
-    </w:p>
-    <w:p>
-      <w:r>
-        <w:rPr>
-          <w:rFonts w:ascii="Calibri" w:hAnsi="Calibri"/>
-          <w:b w:val="0"/>
-          <w:color w:val="2196F3"/>
-          <w:sz w:val="19"/>
+          <w:b/>
+          <w:color w:val="16325C"/>
+          <w:sz w:val="20"/>
         </w:rPr>
         <w:t>KIPI.AI</w:t>
       </w:r>
@@ -142,14 +275,13 @@
     <w:p>
       <w:pPr>
         <w:pStyle w:val="ListBullet"/>
-        <w:ind w:left="360" w:hanging="360"/>
+        <w:spacing w:before="0" w:after="20" w:line="280" w:lineRule="exact"/>
       </w:pPr>
       <w:r>
         <w:rPr>
           <w:rFonts w:ascii="Calibri" w:hAnsi="Calibri"/>
-          <w:b w:val="0"/>
-          <w:color w:val="444444"/>
-          <w:sz w:val="18"/>
+          <w:color w:val="2B2B2B"/>
+          <w:sz w:val="19"/>
         </w:rPr>
         <w:t xml:space="preserve">Lead a team of 8 building a </w:t>
       </w:r>
@@ -157,17 +289,16 @@
         <w:rPr>
           <w:rFonts w:ascii="Calibri" w:hAnsi="Calibri"/>
           <w:b/>
-          <w:color w:val="444444"/>
-          <w:sz w:val="18"/>
+          <w:color w:val="2B2B2B"/>
+          <w:sz w:val="19"/>
         </w:rPr>
         <w:t>Data Mesh</w:t>
       </w:r>
       <w:r>
         <w:rPr>
           <w:rFonts w:ascii="Calibri" w:hAnsi="Calibri"/>
-          <w:b w:val="0"/>
-          <w:color w:val="444444"/>
-          <w:sz w:val="18"/>
+          <w:color w:val="2B2B2B"/>
+          <w:sz w:val="19"/>
         </w:rPr>
         <w:t xml:space="preserve"> on Snowflake for KIPI's largest client, with data products across 5+ domains used by around 200 people.</w:t>
       </w:r>
@@ -175,14 +306,13 @@
     <w:p>
       <w:pPr>
         <w:pStyle w:val="ListBullet"/>
-        <w:ind w:left="360" w:hanging="360"/>
+        <w:spacing w:before="0" w:after="20" w:line="280" w:lineRule="exact"/>
       </w:pPr>
       <w:r>
         <w:rPr>
           <w:rFonts w:ascii="Calibri" w:hAnsi="Calibri"/>
-          <w:b w:val="0"/>
-          <w:color w:val="444444"/>
-          <w:sz w:val="18"/>
+          <w:color w:val="2B2B2B"/>
+          <w:sz w:val="19"/>
         </w:rPr>
         <w:t xml:space="preserve">Built a </w:t>
       </w:r>
@@ -190,17 +320,16 @@
         <w:rPr>
           <w:rFonts w:ascii="Calibri" w:hAnsi="Calibri"/>
           <w:b/>
-          <w:color w:val="444444"/>
-          <w:sz w:val="18"/>
+          <w:color w:val="2B2B2B"/>
+          <w:sz w:val="19"/>
         </w:rPr>
-        <w:t>RAG-based Q&amp;amp;A chatbot</w:t>
+        <w:t>RAG-based Q&amp;A chatbot</w:t>
       </w:r>
       <w:r>
         <w:rPr>
           <w:rFonts w:ascii="Calibri" w:hAnsi="Calibri"/>
-          <w:b w:val="0"/>
-          <w:color w:val="444444"/>
-          <w:sz w:val="18"/>
+          <w:color w:val="2B2B2B"/>
+          <w:sz w:val="19"/>
         </w:rPr>
         <w:t xml:space="preserve">. Used </w:t>
       </w:r>
@@ -208,17 +337,16 @@
         <w:rPr>
           <w:rFonts w:ascii="Calibri" w:hAnsi="Calibri"/>
           <w:b/>
-          <w:color w:val="444444"/>
-          <w:sz w:val="18"/>
+          <w:color w:val="2B2B2B"/>
+          <w:sz w:val="19"/>
         </w:rPr>
         <w:t>AI_PARSE_DOCUMENT</w:t>
       </w:r>
       <w:r>
         <w:rPr>
           <w:rFonts w:ascii="Calibri" w:hAnsi="Calibri"/>
-          <w:b w:val="0"/>
-          <w:color w:val="444444"/>
-          <w:sz w:val="18"/>
+          <w:color w:val="2B2B2B"/>
+          <w:sz w:val="19"/>
         </w:rPr>
         <w:t xml:space="preserve"> to pull text out of PDFs, DOCX files and audio transcripts, chunked and indexed it into Cortex Search, and used Cortex COMPLETE to generate the answers. Shipped as a Streamlit app in Snowflake. Query resolution went from hours to seconds and new joiners get up to speed faster.</w:t>
       </w:r>
@@ -226,47 +354,27 @@
     <w:p>
       <w:pPr>
         <w:pStyle w:val="ListBullet"/>
-        <w:ind w:left="360" w:hanging="360"/>
+        <w:spacing w:before="0" w:after="20" w:line="280" w:lineRule="exact"/>
       </w:pPr>
       <w:r>
         <w:rPr>
           <w:rFonts w:ascii="Calibri" w:hAnsi="Calibri"/>
-          <w:b w:val="0"/>
-          <w:color w:val="444444"/>
-          <w:sz w:val="18"/>
+          <w:color w:val="2B2B2B"/>
+          <w:sz w:val="19"/>
         </w:rPr>
-        <w:t xml:space="preserve">Automated classification of 50K+ customer feedback records a month coming from free-text survey responses, support emails and call recordings. Added </w:t>
-      </w:r>
-      <w:r>
-        <w:rPr>
-          <w:rFonts w:ascii="Calibri" w:hAnsi="Calibri"/>
-          <w:b/>
-          <w:color w:val="444444"/>
-          <w:sz w:val="18"/>
-        </w:rPr>
-        <w:t>Cortex LLM functions</w:t>
-      </w:r>
-      <w:r>
-        <w:rPr>
-          <w:rFonts w:ascii="Calibri" w:hAnsi="Calibri"/>
-          <w:b w:val="0"/>
-          <w:color w:val="444444"/>
-          <w:sz w:val="18"/>
-        </w:rPr>
-        <w:t xml:space="preserve"> (CLASSIFY_TEXT, SENTIMENT, EXTRACT_ANSWER) into the enrichment pipeline, which freed up 3 people and turned a weeks-long backlog into same-day output.</w:t>
+        <w:t>Automated classification of 50K+ customer feedback records a month coming from free-text survey responses, support emails and call recordings. Added Cortex LLM functions (CLASSIFY_TEXT, SENTIMENT, EXTRACT_ANSWER) into the enrichment pipeline, which freed up 3 people and turned a weeks-long backlog into same-day output.</w:t>
       </w:r>
     </w:p>
     <w:p>
       <w:pPr>
         <w:pStyle w:val="ListBullet"/>
-        <w:ind w:left="360" w:hanging="360"/>
+        <w:spacing w:before="0" w:after="20" w:line="280" w:lineRule="exact"/>
       </w:pPr>
       <w:r>
         <w:rPr>
           <w:rFonts w:ascii="Calibri" w:hAnsi="Calibri"/>
-          <w:b w:val="0"/>
-          <w:color w:val="444444"/>
-          <w:sz w:val="18"/>
+          <w:color w:val="2B2B2B"/>
+          <w:sz w:val="19"/>
         </w:rPr>
         <w:t xml:space="preserve">Set up </w:t>
       </w:r>
@@ -274,17 +382,16 @@
         <w:rPr>
           <w:rFonts w:ascii="Calibri" w:hAnsi="Calibri"/>
           <w:b/>
-          <w:color w:val="444444"/>
-          <w:sz w:val="18"/>
+          <w:color w:val="2B2B2B"/>
+          <w:sz w:val="19"/>
         </w:rPr>
         <w:t>Cortex Analyst</w:t>
       </w:r>
       <w:r>
         <w:rPr>
           <w:rFonts w:ascii="Calibri" w:hAnsi="Calibri"/>
-          <w:b w:val="0"/>
-          <w:color w:val="444444"/>
-          <w:sz w:val="18"/>
+          <w:color w:val="2B2B2B"/>
+          <w:sz w:val="19"/>
         </w:rPr>
         <w:t xml:space="preserve"> so business users could ask questions in plain English instead of raising SQL requests. Ad-hoc report requests dropped by around 40%.</w:t>
       </w:r>
@@ -292,14 +399,13 @@
     <w:p>
       <w:pPr>
         <w:pStyle w:val="ListBullet"/>
-        <w:ind w:left="360" w:hanging="360"/>
+        <w:spacing w:before="0" w:after="20" w:line="280" w:lineRule="exact"/>
       </w:pPr>
       <w:r>
         <w:rPr>
           <w:rFonts w:ascii="Calibri" w:hAnsi="Calibri"/>
-          <w:b w:val="0"/>
-          <w:color w:val="444444"/>
-          <w:sz w:val="18"/>
+          <w:color w:val="2B2B2B"/>
+          <w:sz w:val="19"/>
         </w:rPr>
         <w:t xml:space="preserve">Used </w:t>
       </w:r>
@@ -307,17 +413,16 @@
         <w:rPr>
           <w:rFonts w:ascii="Calibri" w:hAnsi="Calibri"/>
           <w:b/>
-          <w:color w:val="444444"/>
-          <w:sz w:val="18"/>
+          <w:color w:val="2B2B2B"/>
+          <w:sz w:val="19"/>
         </w:rPr>
         <w:t>Document AI</w:t>
       </w:r>
       <w:r>
         <w:rPr>
           <w:rFonts w:ascii="Calibri" w:hAnsi="Calibri"/>
-          <w:b w:val="0"/>
-          <w:color w:val="444444"/>
-          <w:sz w:val="18"/>
+          <w:color w:val="2B2B2B"/>
+          <w:sz w:val="19"/>
         </w:rPr>
         <w:t xml:space="preserve"> to pull amounts, dates, vendor names and line items out of vendor invoices and contracts, feeding straight into the finance data product. Cut roughly 20 hours a week of manual data entry and sped up accounts payable processing.</w:t>
       </w:r>
@@ -325,14 +430,13 @@
     <w:p>
       <w:pPr>
         <w:pStyle w:val="ListBullet"/>
-        <w:ind w:left="360" w:hanging="360"/>
+        <w:spacing w:before="0" w:after="20" w:line="280" w:lineRule="exact"/>
       </w:pPr>
       <w:r>
         <w:rPr>
           <w:rFonts w:ascii="Calibri" w:hAnsi="Calibri"/>
-          <w:b w:val="0"/>
-          <w:color w:val="444444"/>
-          <w:sz w:val="18"/>
+          <w:color w:val="2B2B2B"/>
+          <w:sz w:val="19"/>
         </w:rPr>
         <w:t xml:space="preserve">Fine-tuned a base LLM with </w:t>
       </w:r>
@@ -340,17 +444,16 @@
         <w:rPr>
           <w:rFonts w:ascii="Calibri" w:hAnsi="Calibri"/>
           <w:b/>
-          <w:color w:val="444444"/>
-          <w:sz w:val="18"/>
+          <w:color w:val="2B2B2B"/>
+          <w:sz w:val="19"/>
         </w:rPr>
         <w:t>Cortex Fine-Tuning</w:t>
       </w:r>
       <w:r>
         <w:rPr>
           <w:rFonts w:ascii="Calibri" w:hAnsi="Calibri"/>
-          <w:b w:val="0"/>
-          <w:color w:val="444444"/>
-          <w:sz w:val="18"/>
+          <w:color w:val="2B2B2B"/>
+          <w:sz w:val="19"/>
         </w:rPr>
         <w:t xml:space="preserve"> on client-specific labels, which improved classification accuracy by around 15% over the out-of-the-box model.</w:t>
       </w:r>
@@ -358,14 +461,13 @@
     <w:p>
       <w:pPr>
         <w:pStyle w:val="ListBullet"/>
-        <w:ind w:left="360" w:hanging="360"/>
+        <w:spacing w:before="0" w:after="20" w:line="280" w:lineRule="exact"/>
       </w:pPr>
       <w:r>
         <w:rPr>
           <w:rFonts w:ascii="Calibri" w:hAnsi="Calibri"/>
-          <w:b w:val="0"/>
-          <w:color w:val="444444"/>
-          <w:sz w:val="18"/>
+          <w:color w:val="2B2B2B"/>
+          <w:sz w:val="19"/>
         </w:rPr>
         <w:t>Cut compute cost on the main ingestion pipeline by 60%. Moved it to incremental loads with micro-batching and rewrote the SCD2 logic so it runs on an XS warehouse instead of an L, on over 1TB a day.</w:t>
       </w:r>
@@ -373,14 +475,13 @@
     <w:p>
       <w:pPr>
         <w:pStyle w:val="ListBullet"/>
-        <w:ind w:left="360" w:hanging="360"/>
+        <w:spacing w:before="0" w:after="20" w:line="280" w:lineRule="exact"/>
       </w:pPr>
       <w:r>
         <w:rPr>
           <w:rFonts w:ascii="Calibri" w:hAnsi="Calibri"/>
-          <w:b w:val="0"/>
-          <w:color w:val="444444"/>
-          <w:sz w:val="18"/>
+          <w:color w:val="2B2B2B"/>
+          <w:sz w:val="19"/>
         </w:rPr>
         <w:t>Wrote macros that purge stale snapshots automatically, cutting storage and processing overhead by around 40%.</w:t>
       </w:r>
@@ -388,14 +489,13 @@
     <w:p>
       <w:pPr>
         <w:pStyle w:val="ListBullet"/>
-        <w:ind w:left="360" w:hanging="360"/>
+        <w:spacing w:before="0" w:after="20" w:line="280" w:lineRule="exact"/>
       </w:pPr>
       <w:r>
         <w:rPr>
           <w:rFonts w:ascii="Calibri" w:hAnsi="Calibri"/>
-          <w:b w:val="0"/>
-          <w:color w:val="444444"/>
-          <w:sz w:val="18"/>
+          <w:color w:val="2B2B2B"/>
+          <w:sz w:val="19"/>
         </w:rPr>
         <w:t>Set up coding standards, PR review process, branching strategy and naming conventions. None of this was consistent before I joined.</w:t>
       </w:r>
@@ -403,14 +503,13 @@
     <w:p>
       <w:pPr>
         <w:pStyle w:val="ListBullet"/>
-        <w:ind w:left="360" w:hanging="360"/>
+        <w:spacing w:before="0" w:after="20" w:line="280" w:lineRule="exact"/>
       </w:pPr>
       <w:r>
         <w:rPr>
           <w:rFonts w:ascii="Calibri" w:hAnsi="Calibri"/>
-          <w:b w:val="0"/>
-          <w:color w:val="444444"/>
-          <w:sz w:val="18"/>
+          <w:color w:val="2B2B2B"/>
+          <w:sz w:val="19"/>
         </w:rPr>
         <w:t>Built a PII scanner that checks every data product for missing Row-Level Security or masking policies and alerts the domain owner when it finds a gap.</w:t>
       </w:r>
@@ -418,14 +517,13 @@
     <w:p>
       <w:pPr>
         <w:pStyle w:val="ListBullet"/>
-        <w:ind w:left="360" w:hanging="360"/>
+        <w:spacing w:before="0" w:after="20" w:line="280" w:lineRule="exact"/>
       </w:pPr>
       <w:r>
         <w:rPr>
           <w:rFonts w:ascii="Calibri" w:hAnsi="Calibri"/>
-          <w:b w:val="0"/>
-          <w:color w:val="444444"/>
-          <w:sz w:val="18"/>
+          <w:color w:val="2B2B2B"/>
+          <w:sz w:val="19"/>
         </w:rPr>
         <w:t xml:space="preserve">Built the data quality layer with </w:t>
       </w:r>
@@ -433,17 +531,16 @@
         <w:rPr>
           <w:rFonts w:ascii="Calibri" w:hAnsi="Calibri"/>
           <w:b/>
-          <w:color w:val="444444"/>
-          <w:sz w:val="18"/>
+          <w:color w:val="2B2B2B"/>
+          <w:sz w:val="19"/>
         </w:rPr>
         <w:t>dbt-expectations</w:t>
       </w:r>
       <w:r>
         <w:rPr>
           <w:rFonts w:ascii="Calibri" w:hAnsi="Calibri"/>
-          <w:b w:val="0"/>
-          <w:color w:val="444444"/>
-          <w:sz w:val="18"/>
+          <w:color w:val="2B2B2B"/>
+          <w:sz w:val="19"/>
         </w:rPr>
         <w:t xml:space="preserve"> and am putting together a wider governance framework so quality holds up as new domains come on.</w:t>
       </w:r>
@@ -451,14 +548,13 @@
     <w:p>
       <w:pPr>
         <w:pStyle w:val="ListBullet"/>
-        <w:ind w:left="360" w:hanging="360"/>
+        <w:spacing w:before="0" w:after="20" w:line="280" w:lineRule="exact"/>
       </w:pPr>
       <w:r>
         <w:rPr>
           <w:rFonts w:ascii="Calibri" w:hAnsi="Calibri"/>
-          <w:b w:val="0"/>
-          <w:color w:val="444444"/>
-          <w:sz w:val="18"/>
+          <w:color w:val="2B2B2B"/>
+          <w:sz w:val="19"/>
         </w:rPr>
         <w:t>Run weekly sessions with the team on code walkthroughs, architecture and practices.</w:t>
       </w:r>
@@ -466,46 +562,41 @@
     <w:p>
       <w:pPr>
         <w:pStyle w:val="ListBullet"/>
-        <w:ind w:left="360" w:hanging="360"/>
+        <w:spacing w:before="0" w:after="20" w:line="280" w:lineRule="exact"/>
       </w:pPr>
       <w:r>
         <w:rPr>
           <w:rFonts w:ascii="Calibri" w:hAnsi="Calibri"/>
-          <w:b w:val="0"/>
-          <w:color w:val="444444"/>
-          <w:sz w:val="18"/>
+          <w:color w:val="2B2B2B"/>
+          <w:sz w:val="19"/>
         </w:rPr>
         <w:t>Main point of contact for 3 client stakeholder groups. Handle sprint planning, backlog grooming and delivery timelines.</w:t>
       </w:r>
     </w:p>
-    <w:p/>
     <w:p>
+      <w:pPr>
+        <w:spacing w:before="120" w:after="0"/>
+      </w:pPr>
       <w:r>
         <w:rPr>
           <w:rFonts w:ascii="Calibri" w:hAnsi="Calibri"/>
           <w:b/>
-          <w:color w:val="1A1A1A"/>
-          <w:sz w:val="22"/>
+          <w:color w:val="111111"/>
+          <w:sz w:val="21"/>
         </w:rPr>
-        <w:t>Senior Technical Lead</w:t>
+        <w:t>Senior Technical Lead  |  June 2023 - July 2025</w:t>
       </w:r>
+    </w:p>
+    <w:p>
+      <w:pPr>
+        <w:spacing w:before="0" w:after="40"/>
+      </w:pPr>
       <w:r>
         <w:rPr>
           <w:rFonts w:ascii="Calibri" w:hAnsi="Calibri"/>
-          <w:b w:val="0"/>
-          <w:color w:val="777777"/>
-          <w:sz w:val="18"/>
-        </w:rPr>
-        <w:t xml:space="preserve">  |  June 2023 - July 2025</w:t>
-      </w:r>
-    </w:p>
-    <w:p>
-      <w:r>
-        <w:rPr>
-          <w:rFonts w:ascii="Calibri" w:hAnsi="Calibri"/>
-          <w:b w:val="0"/>
-          <w:color w:val="2196F3"/>
-          <w:sz w:val="19"/>
+          <w:b/>
+          <w:color w:val="16325C"/>
+          <w:sz w:val="20"/>
         </w:rPr>
         <w:t>Beyond Key</w:t>
       </w:r>
@@ -513,14 +604,13 @@
     <w:p>
       <w:pPr>
         <w:pStyle w:val="ListBullet"/>
-        <w:ind w:left="360" w:hanging="360"/>
+        <w:spacing w:before="0" w:after="20" w:line="280" w:lineRule="exact"/>
       </w:pPr>
       <w:r>
         <w:rPr>
           <w:rFonts w:ascii="Calibri" w:hAnsi="Calibri"/>
-          <w:b w:val="0"/>
-          <w:color w:val="444444"/>
-          <w:sz w:val="18"/>
+          <w:color w:val="2B2B2B"/>
+          <w:sz w:val="19"/>
         </w:rPr>
         <w:t>Led 8+ engineers on Snowflake migrations and new builds for enterprise clients.</w:t>
       </w:r>
@@ -528,14 +618,13 @@
     <w:p>
       <w:pPr>
         <w:pStyle w:val="ListBullet"/>
-        <w:ind w:left="360" w:hanging="360"/>
+        <w:spacing w:before="0" w:after="20" w:line="280" w:lineRule="exact"/>
       </w:pPr>
       <w:r>
         <w:rPr>
           <w:rFonts w:ascii="Calibri" w:hAnsi="Calibri"/>
-          <w:b w:val="0"/>
-          <w:color w:val="444444"/>
-          <w:sz w:val="18"/>
+          <w:color w:val="2B2B2B"/>
+          <w:sz w:val="19"/>
         </w:rPr>
         <w:t xml:space="preserve">Brought </w:t>
       </w:r>
@@ -543,17 +632,16 @@
         <w:rPr>
           <w:rFonts w:ascii="Calibri" w:hAnsi="Calibri"/>
           <w:b/>
-          <w:color w:val="444444"/>
-          <w:sz w:val="18"/>
+          <w:color w:val="2B2B2B"/>
+          <w:sz w:val="19"/>
         </w:rPr>
         <w:t>dbt</w:t>
       </w:r>
       <w:r>
         <w:rPr>
           <w:rFonts w:ascii="Calibri" w:hAnsi="Calibri"/>
-          <w:b w:val="0"/>
-          <w:color w:val="444444"/>
-          <w:sz w:val="18"/>
+          <w:color w:val="2B2B2B"/>
+          <w:sz w:val="19"/>
         </w:rPr>
         <w:t xml:space="preserve"> into client projects from nothing. Set up the project structure, wrote the standards documentation and built CI/CD through Azure DevOps for clients who had never used dbt.</w:t>
       </w:r>
@@ -561,14 +649,13 @@
     <w:p>
       <w:pPr>
         <w:pStyle w:val="ListBullet"/>
-        <w:ind w:left="360" w:hanging="360"/>
+        <w:spacing w:before="0" w:after="20" w:line="280" w:lineRule="exact"/>
       </w:pPr>
       <w:r>
         <w:rPr>
           <w:rFonts w:ascii="Calibri" w:hAnsi="Calibri"/>
-          <w:b w:val="0"/>
-          <w:color w:val="444444"/>
-          <w:sz w:val="18"/>
+          <w:color w:val="2B2B2B"/>
+          <w:sz w:val="19"/>
         </w:rPr>
         <w:t xml:space="preserve">Designed ETL/ELT pipelines on Snowflake using </w:t>
       </w:r>
@@ -576,17 +663,16 @@
         <w:rPr>
           <w:rFonts w:ascii="Calibri" w:hAnsi="Calibri"/>
           <w:b/>
-          <w:color w:val="444444"/>
-          <w:sz w:val="18"/>
+          <w:color w:val="2B2B2B"/>
+          <w:sz w:val="19"/>
         </w:rPr>
         <w:t>medallion architecture</w:t>
       </w:r>
       <w:r>
         <w:rPr>
           <w:rFonts w:ascii="Calibri" w:hAnsi="Calibri"/>
-          <w:b w:val="0"/>
-          <w:color w:val="444444"/>
-          <w:sz w:val="18"/>
+          <w:color w:val="2B2B2B"/>
+          <w:sz w:val="19"/>
         </w:rPr>
         <w:t xml:space="preserve"> (bronze/silver/gold) and star schema modelling, turning raw data into datasets analysts could use directly.</w:t>
       </w:r>
@@ -594,14 +680,13 @@
     <w:p>
       <w:pPr>
         <w:pStyle w:val="ListBullet"/>
-        <w:ind w:left="360" w:hanging="360"/>
+        <w:spacing w:before="0" w:after="20" w:line="280" w:lineRule="exact"/>
       </w:pPr>
       <w:r>
         <w:rPr>
           <w:rFonts w:ascii="Calibri" w:hAnsi="Calibri"/>
-          <w:b w:val="0"/>
-          <w:color w:val="444444"/>
-          <w:sz w:val="18"/>
+          <w:color w:val="2B2B2B"/>
+          <w:sz w:val="19"/>
         </w:rPr>
         <w:t xml:space="preserve">Built </w:t>
       </w:r>
@@ -609,17 +694,16 @@
         <w:rPr>
           <w:rFonts w:ascii="Calibri" w:hAnsi="Calibri"/>
           <w:b/>
-          <w:color w:val="444444"/>
-          <w:sz w:val="18"/>
+          <w:color w:val="2B2B2B"/>
+          <w:sz w:val="19"/>
         </w:rPr>
         <w:t>ADF pipelines</w:t>
       </w:r>
       <w:r>
         <w:rPr>
           <w:rFonts w:ascii="Calibri" w:hAnsi="Calibri"/>
-          <w:b w:val="0"/>
-          <w:color w:val="444444"/>
-          <w:sz w:val="18"/>
+          <w:color w:val="2B2B2B"/>
+          <w:sz w:val="19"/>
         </w:rPr>
         <w:t xml:space="preserve"> with dynamic schema detection that created Snowflake stages and tables on their own, so nobody had to hand-write DDL for each new source.</w:t>
       </w:r>
@@ -627,14 +711,13 @@
     <w:p>
       <w:pPr>
         <w:pStyle w:val="ListBullet"/>
-        <w:ind w:left="360" w:hanging="360"/>
+        <w:spacing w:before="0" w:after="20" w:line="280" w:lineRule="exact"/>
       </w:pPr>
       <w:r>
         <w:rPr>
           <w:rFonts w:ascii="Calibri" w:hAnsi="Calibri"/>
-          <w:b w:val="0"/>
-          <w:color w:val="444444"/>
-          <w:sz w:val="18"/>
+          <w:color w:val="2B2B2B"/>
+          <w:sz w:val="19"/>
         </w:rPr>
         <w:t>Wrote JavaScript stored procedures in Snowflake to set up stages and Snowpipes from config table entries.</w:t>
       </w:r>
@@ -642,14 +725,13 @@
     <w:p>
       <w:pPr>
         <w:pStyle w:val="ListBullet"/>
-        <w:ind w:left="360" w:hanging="360"/>
+        <w:spacing w:before="0" w:after="20" w:line="280" w:lineRule="exact"/>
       </w:pPr>
       <w:r>
         <w:rPr>
           <w:rFonts w:ascii="Calibri" w:hAnsi="Calibri"/>
-          <w:b w:val="0"/>
-          <w:color w:val="444444"/>
-          <w:sz w:val="18"/>
+          <w:color w:val="2B2B2B"/>
+          <w:sz w:val="19"/>
         </w:rPr>
         <w:t xml:space="preserve">Set up </w:t>
       </w:r>
@@ -657,17 +739,16 @@
         <w:rPr>
           <w:rFonts w:ascii="Calibri" w:hAnsi="Calibri"/>
           <w:b/>
-          <w:color w:val="444444"/>
-          <w:sz w:val="18"/>
+          <w:color w:val="2B2B2B"/>
+          <w:sz w:val="19"/>
         </w:rPr>
         <w:t>Secure Data Sharing</w:t>
       </w:r>
       <w:r>
         <w:rPr>
           <w:rFonts w:ascii="Calibri" w:hAnsi="Calibri"/>
-          <w:b w:val="0"/>
-          <w:color w:val="444444"/>
-          <w:sz w:val="18"/>
+          <w:color w:val="2B2B2B"/>
+          <w:sz w:val="19"/>
         </w:rPr>
         <w:t xml:space="preserve"> for cross-organization distribution, plus RBAC, dynamic masking and tag-based masking on sensitive columns.</w:t>
       </w:r>
@@ -675,14 +756,13 @@
     <w:p>
       <w:pPr>
         <w:pStyle w:val="ListBullet"/>
-        <w:ind w:left="360" w:hanging="360"/>
+        <w:spacing w:before="0" w:after="20" w:line="280" w:lineRule="exact"/>
       </w:pPr>
       <w:r>
         <w:rPr>
           <w:rFonts w:ascii="Calibri" w:hAnsi="Calibri"/>
-          <w:b w:val="0"/>
-          <w:color w:val="444444"/>
-          <w:sz w:val="18"/>
+          <w:color w:val="2B2B2B"/>
+          <w:sz w:val="19"/>
         </w:rPr>
         <w:t>Wrote reusable macros for error logging on failed dbt models and for handling insert and update timestamps consistently across projects.</w:t>
       </w:r>
@@ -690,14 +770,13 @@
     <w:p>
       <w:pPr>
         <w:pStyle w:val="ListBullet"/>
-        <w:ind w:left="360" w:hanging="360"/>
+        <w:spacing w:before="0" w:after="20" w:line="280" w:lineRule="exact"/>
       </w:pPr>
       <w:r>
         <w:rPr>
           <w:rFonts w:ascii="Calibri" w:hAnsi="Calibri"/>
-          <w:b w:val="0"/>
-          <w:color w:val="444444"/>
-          <w:sz w:val="18"/>
+          <w:color w:val="2B2B2B"/>
+          <w:sz w:val="19"/>
         </w:rPr>
         <w:t>Wrote custom dbt tests for referential integrity and source-to-target row count checks.</w:t>
       </w:r>
@@ -705,14 +784,13 @@
     <w:p>
       <w:pPr>
         <w:pStyle w:val="ListBullet"/>
-        <w:ind w:left="360" w:hanging="360"/>
+        <w:spacing w:before="0" w:after="20" w:line="280" w:lineRule="exact"/>
       </w:pPr>
       <w:r>
         <w:rPr>
           <w:rFonts w:ascii="Calibri" w:hAnsi="Calibri"/>
-          <w:b w:val="0"/>
-          <w:color w:val="444444"/>
-          <w:sz w:val="18"/>
+          <w:color w:val="2B2B2B"/>
+          <w:sz w:val="19"/>
         </w:rPr>
         <w:t>Ran internal Snowflake and dbt training for 20+ engineers and led the Snowflake practice POC for Beyond Key.</w:t>
       </w:r>
@@ -720,14 +798,13 @@
     <w:p>
       <w:pPr>
         <w:pStyle w:val="ListBullet"/>
-        <w:ind w:left="360" w:hanging="360"/>
+        <w:spacing w:before="0" w:after="20" w:line="280" w:lineRule="exact"/>
       </w:pPr>
       <w:r>
         <w:rPr>
           <w:rFonts w:ascii="Calibri" w:hAnsi="Calibri"/>
-          <w:b w:val="0"/>
-          <w:color w:val="444444"/>
-          <w:sz w:val="18"/>
+          <w:color w:val="2B2B2B"/>
+          <w:sz w:val="19"/>
         </w:rPr>
         <w:t>Rebuilt an existing ADF extraction pipeline into a modular design so the team could add new sources without touching core logic.</w:t>
       </w:r>
@@ -735,46 +812,41 @@
     <w:p>
       <w:pPr>
         <w:pStyle w:val="ListBullet"/>
-        <w:ind w:left="360" w:hanging="360"/>
+        <w:spacing w:before="0" w:after="20" w:line="280" w:lineRule="exact"/>
       </w:pPr>
       <w:r>
         <w:rPr>
           <w:rFonts w:ascii="Calibri" w:hAnsi="Calibri"/>
-          <w:b w:val="0"/>
-          <w:color w:val="444444"/>
-          <w:sz w:val="18"/>
+          <w:color w:val="2B2B2B"/>
+          <w:sz w:val="19"/>
         </w:rPr>
         <w:t>Built export tasks to push data out of Snowflake to downstream consumers.</w:t>
       </w:r>
     </w:p>
-    <w:p/>
     <w:p>
+      <w:pPr>
+        <w:spacing w:before="120" w:after="0"/>
+      </w:pPr>
       <w:r>
         <w:rPr>
           <w:rFonts w:ascii="Calibri" w:hAnsi="Calibri"/>
           <w:b/>
-          <w:color w:val="1A1A1A"/>
-          <w:sz w:val="22"/>
+          <w:color w:val="111111"/>
+          <w:sz w:val="21"/>
         </w:rPr>
-        <w:t>Senior Data Engineer</w:t>
+        <w:t>Senior Data Engineer  |  June 2021 - June 2023</w:t>
       </w:r>
+    </w:p>
+    <w:p>
+      <w:pPr>
+        <w:spacing w:before="0" w:after="40"/>
+      </w:pPr>
       <w:r>
         <w:rPr>
           <w:rFonts w:ascii="Calibri" w:hAnsi="Calibri"/>
-          <w:b w:val="0"/>
-          <w:color w:val="777777"/>
-          <w:sz w:val="18"/>
-        </w:rPr>
-        <w:t xml:space="preserve">  |  June 2021 - June 2023</w:t>
-      </w:r>
-    </w:p>
-    <w:p>
-      <w:r>
-        <w:rPr>
-          <w:rFonts w:ascii="Calibri" w:hAnsi="Calibri"/>
-          <w:b w:val="0"/>
-          <w:color w:val="2196F3"/>
-          <w:sz w:val="19"/>
+          <w:b/>
+          <w:color w:val="16325C"/>
+          <w:sz w:val="20"/>
         </w:rPr>
         <w:t>Visual BI Solutions (an Atos Company)</w:t>
       </w:r>
@@ -782,14 +854,13 @@
     <w:p>
       <w:pPr>
         <w:pStyle w:val="ListBullet"/>
-        <w:ind w:left="360" w:hanging="360"/>
+        <w:spacing w:before="0" w:after="20" w:line="280" w:lineRule="exact"/>
       </w:pPr>
       <w:r>
         <w:rPr>
           <w:rFonts w:ascii="Calibri" w:hAnsi="Calibri"/>
-          <w:b w:val="0"/>
-          <w:color w:val="444444"/>
-          <w:sz w:val="18"/>
+          <w:color w:val="2B2B2B"/>
+          <w:sz w:val="19"/>
         </w:rPr>
         <w:t xml:space="preserve">Built Snowflake ETL pipelines with dbt across several client projects, using </w:t>
       </w:r>
@@ -797,17 +868,16 @@
         <w:rPr>
           <w:rFonts w:ascii="Calibri" w:hAnsi="Calibri"/>
           <w:b/>
-          <w:color w:val="444444"/>
-          <w:sz w:val="18"/>
+          <w:color w:val="2B2B2B"/>
+          <w:sz w:val="19"/>
         </w:rPr>
         <w:t>Data Vault</w:t>
       </w:r>
       <w:r>
         <w:rPr>
           <w:rFonts w:ascii="Calibri" w:hAnsi="Calibri"/>
-          <w:b w:val="0"/>
-          <w:color w:val="444444"/>
-          <w:sz w:val="18"/>
+          <w:color w:val="2B2B2B"/>
+          <w:sz w:val="19"/>
         </w:rPr>
         <w:t xml:space="preserve"> or star schema depending on what each client needed for reporting.</w:t>
       </w:r>
@@ -815,14 +885,13 @@
     <w:p>
       <w:pPr>
         <w:pStyle w:val="ListBullet"/>
-        <w:ind w:left="360" w:hanging="360"/>
+        <w:spacing w:before="0" w:after="20" w:line="280" w:lineRule="exact"/>
       </w:pPr>
       <w:r>
         <w:rPr>
           <w:rFonts w:ascii="Calibri" w:hAnsi="Calibri"/>
-          <w:b w:val="0"/>
-          <w:color w:val="444444"/>
-          <w:sz w:val="18"/>
+          <w:color w:val="2B2B2B"/>
+          <w:sz w:val="19"/>
         </w:rPr>
         <w:t xml:space="preserve">Wrote reusable macros for </w:t>
       </w:r>
@@ -830,17 +899,16 @@
         <w:rPr>
           <w:rFonts w:ascii="Calibri" w:hAnsi="Calibri"/>
           <w:b/>
-          <w:color w:val="444444"/>
-          <w:sz w:val="18"/>
+          <w:color w:val="2B2B2B"/>
+          <w:sz w:val="19"/>
         </w:rPr>
         <w:t>SCD Type 1 and Type 2</w:t>
       </w:r>
       <w:r>
         <w:rPr>
           <w:rFonts w:ascii="Calibri" w:hAnsi="Calibri"/>
-          <w:b w:val="0"/>
-          <w:color w:val="444444"/>
-          <w:sz w:val="18"/>
+          <w:color w:val="2B2B2B"/>
+          <w:sz w:val="19"/>
         </w:rPr>
         <w:t xml:space="preserve"> across mixed column types, which removed per-table models and cut repeated code by around 60%.</w:t>
       </w:r>
@@ -848,14 +916,13 @@
     <w:p>
       <w:pPr>
         <w:pStyle w:val="ListBullet"/>
-        <w:ind w:left="360" w:hanging="360"/>
+        <w:spacing w:before="0" w:after="20" w:line="280" w:lineRule="exact"/>
       </w:pPr>
       <w:r>
         <w:rPr>
           <w:rFonts w:ascii="Calibri" w:hAnsi="Calibri"/>
-          <w:b w:val="0"/>
-          <w:color w:val="444444"/>
-          <w:sz w:val="18"/>
+          <w:color w:val="2B2B2B"/>
+          <w:sz w:val="19"/>
         </w:rPr>
         <w:t>Tracked down a null primary key problem in left joins caused by late-arriving dimension records. Prototyped the fix, validated it with the client and put it into production.</w:t>
       </w:r>
@@ -863,14 +930,13 @@
     <w:p>
       <w:pPr>
         <w:pStyle w:val="ListBullet"/>
-        <w:ind w:left="360" w:hanging="360"/>
+        <w:spacing w:before="0" w:after="20" w:line="280" w:lineRule="exact"/>
       </w:pPr>
       <w:r>
         <w:rPr>
           <w:rFonts w:ascii="Calibri" w:hAnsi="Calibri"/>
-          <w:b w:val="0"/>
-          <w:color w:val="444444"/>
-          <w:sz w:val="18"/>
+          <w:color w:val="2B2B2B"/>
+          <w:sz w:val="19"/>
         </w:rPr>
         <w:t>Worked with every dbt materialization (table, view, incremental, snapshot, ephemeral) and handled dbt version upgrades, testing impact before each one.</w:t>
       </w:r>
@@ -878,14 +944,13 @@
     <w:p>
       <w:pPr>
         <w:pStyle w:val="ListBullet"/>
-        <w:ind w:left="360" w:hanging="360"/>
+        <w:spacing w:before="0" w:after="20" w:line="280" w:lineRule="exact"/>
       </w:pPr>
       <w:r>
         <w:rPr>
           <w:rFonts w:ascii="Calibri" w:hAnsi="Calibri"/>
-          <w:b w:val="0"/>
-          <w:color w:val="444444"/>
-          <w:sz w:val="18"/>
+          <w:color w:val="2B2B2B"/>
+          <w:sz w:val="19"/>
         </w:rPr>
         <w:t xml:space="preserve">Set up data quality testing with </w:t>
       </w:r>
@@ -893,17 +958,16 @@
         <w:rPr>
           <w:rFonts w:ascii="Calibri" w:hAnsi="Calibri"/>
           <w:b/>
-          <w:color w:val="444444"/>
-          <w:sz w:val="18"/>
+          <w:color w:val="2B2B2B"/>
+          <w:sz w:val="19"/>
         </w:rPr>
         <w:t>dbt-expectations</w:t>
       </w:r>
       <w:r>
         <w:rPr>
           <w:rFonts w:ascii="Calibri" w:hAnsi="Calibri"/>
-          <w:b w:val="0"/>
-          <w:color w:val="444444"/>
-          <w:sz w:val="18"/>
+          <w:color w:val="2B2B2B"/>
+          <w:sz w:val="19"/>
         </w:rPr>
         <w:t>, getting 95%+ coverage on critical models with checks for region filtering, row count matching and nulls.</w:t>
       </w:r>
@@ -911,14 +975,13 @@
     <w:p>
       <w:pPr>
         <w:pStyle w:val="ListBullet"/>
-        <w:ind w:left="360" w:hanging="360"/>
+        <w:spacing w:before="0" w:after="20" w:line="280" w:lineRule="exact"/>
       </w:pPr>
       <w:r>
         <w:rPr>
           <w:rFonts w:ascii="Calibri" w:hAnsi="Calibri"/>
-          <w:b w:val="0"/>
-          <w:color w:val="444444"/>
-          <w:sz w:val="18"/>
+          <w:color w:val="2B2B2B"/>
+          <w:sz w:val="19"/>
         </w:rPr>
         <w:t>Optimized complex SQL using CTEs, window functions and recursive queries. Overrode global dbt macros so full-refresh could switch between truncate-reload and drop-recreate at runtime.</w:t>
       </w:r>
@@ -926,14 +989,13 @@
     <w:p>
       <w:pPr>
         <w:pStyle w:val="ListBullet"/>
-        <w:ind w:left="360" w:hanging="360"/>
+        <w:spacing w:before="0" w:after="20" w:line="280" w:lineRule="exact"/>
       </w:pPr>
       <w:r>
         <w:rPr>
           <w:rFonts w:ascii="Calibri" w:hAnsi="Calibri"/>
-          <w:b w:val="0"/>
-          <w:color w:val="444444"/>
-          <w:sz w:val="18"/>
+          <w:color w:val="2B2B2B"/>
+          <w:sz w:val="19"/>
         </w:rPr>
         <w:t>Designed a recovery process to rebuild historical SCD data from raw sources when snapshots got corrupted, bringing recovery time down from days to under 4 hours.</w:t>
       </w:r>
@@ -941,14 +1003,13 @@
     <w:p>
       <w:pPr>
         <w:pStyle w:val="ListBullet"/>
-        <w:ind w:left="360" w:hanging="360"/>
+        <w:spacing w:before="0" w:after="20" w:line="280" w:lineRule="exact"/>
       </w:pPr>
       <w:r>
         <w:rPr>
           <w:rFonts w:ascii="Calibri" w:hAnsi="Calibri"/>
-          <w:b w:val="0"/>
-          <w:color w:val="444444"/>
-          <w:sz w:val="18"/>
+          <w:color w:val="2B2B2B"/>
+          <w:sz w:val="19"/>
         </w:rPr>
         <w:t xml:space="preserve">Built an </w:t>
       </w:r>
@@ -956,17 +1017,16 @@
         <w:rPr>
           <w:rFonts w:ascii="Calibri" w:hAnsi="Calibri"/>
           <w:b/>
-          <w:color w:val="444444"/>
-          <w:sz w:val="18"/>
+          <w:color w:val="2B2B2B"/>
+          <w:sz w:val="19"/>
         </w:rPr>
         <w:t>RBAC automation tool</w:t>
       </w:r>
       <w:r>
         <w:rPr>
           <w:rFonts w:ascii="Calibri" w:hAnsi="Calibri"/>
-          <w:b w:val="0"/>
-          <w:color w:val="444444"/>
-          <w:sz w:val="18"/>
+          <w:color w:val="2B2B2B"/>
+          <w:sz w:val="19"/>
         </w:rPr>
         <w:t xml:space="preserve"> with PowerApps, Power Automate and Azure Functions, replacing manual SQL provisioning with a self-service form and cutting provisioning time by around 80%.</w:t>
       </w:r>
@@ -974,14 +1034,13 @@
     <w:p>
       <w:pPr>
         <w:pStyle w:val="ListBullet"/>
-        <w:ind w:left="360" w:hanging="360"/>
+        <w:spacing w:before="0" w:after="20" w:line="280" w:lineRule="exact"/>
       </w:pPr>
       <w:r>
         <w:rPr>
           <w:rFonts w:ascii="Calibri" w:hAnsi="Calibri"/>
-          <w:b w:val="0"/>
-          <w:color w:val="444444"/>
-          <w:sz w:val="18"/>
+          <w:color w:val="2B2B2B"/>
+          <w:sz w:val="19"/>
         </w:rPr>
         <w:t>Built Power BI dashboards on warehouse credit usage, which let leadership spot 25%+ wasted compute and resize warehouses.</w:t>
       </w:r>
@@ -989,14 +1048,13 @@
     <w:p>
       <w:pPr>
         <w:pStyle w:val="ListBullet"/>
-        <w:ind w:left="360" w:hanging="360"/>
+        <w:spacing w:before="0" w:after="20" w:line="280" w:lineRule="exact"/>
       </w:pPr>
       <w:r>
         <w:rPr>
           <w:rFonts w:ascii="Calibri" w:hAnsi="Calibri"/>
-          <w:b w:val="0"/>
-          <w:color w:val="444444"/>
-          <w:sz w:val="18"/>
+          <w:color w:val="2B2B2B"/>
+          <w:sz w:val="19"/>
         </w:rPr>
         <w:t>Owned the Git branching strategy in Azure DevOps for a dbt project of around 200 models.</w:t>
       </w:r>
@@ -1004,46 +1062,41 @@
     <w:p>
       <w:pPr>
         <w:pStyle w:val="ListBullet"/>
-        <w:ind w:left="360" w:hanging="360"/>
+        <w:spacing w:before="0" w:after="20" w:line="280" w:lineRule="exact"/>
       </w:pPr>
       <w:r>
         <w:rPr>
           <w:rFonts w:ascii="Calibri" w:hAnsi="Calibri"/>
-          <w:b w:val="0"/>
-          <w:color w:val="444444"/>
-          <w:sz w:val="18"/>
+          <w:color w:val="2B2B2B"/>
+          <w:sz w:val="19"/>
         </w:rPr>
         <w:t>Streamed MSFT stock prices through ADF every minute and stored the high for each 5-minute window in Azure SQL, as part of internal COE work.</w:t>
       </w:r>
     </w:p>
-    <w:p/>
     <w:p>
+      <w:pPr>
+        <w:spacing w:before="120" w:after="0"/>
+      </w:pPr>
       <w:r>
         <w:rPr>
           <w:rFonts w:ascii="Calibri" w:hAnsi="Calibri"/>
           <w:b/>
-          <w:color w:val="1A1A1A"/>
-          <w:sz w:val="22"/>
+          <w:color w:val="111111"/>
+          <w:sz w:val="21"/>
         </w:rPr>
-        <w:t>Software Engineer</w:t>
+        <w:t>Software Engineer  |  March 2018 - May 2021</w:t>
       </w:r>
+    </w:p>
+    <w:p>
+      <w:pPr>
+        <w:spacing w:before="0" w:after="40"/>
+      </w:pPr>
       <w:r>
         <w:rPr>
           <w:rFonts w:ascii="Calibri" w:hAnsi="Calibri"/>
-          <w:b w:val="0"/>
-          <w:color w:val="777777"/>
-          <w:sz w:val="18"/>
-        </w:rPr>
-        <w:t xml:space="preserve">  |  March 2018 - May 2021</w:t>
-      </w:r>
-    </w:p>
-    <w:p>
-      <w:r>
-        <w:rPr>
-          <w:rFonts w:ascii="Calibri" w:hAnsi="Calibri"/>
-          <w:b w:val="0"/>
-          <w:color w:val="2196F3"/>
-          <w:sz w:val="19"/>
+          <w:b/>
+          <w:color w:val="16325C"/>
+          <w:sz w:val="20"/>
         </w:rPr>
         <w:t>Tech Mahindra Ltd.</w:t>
       </w:r>
@@ -1051,14 +1104,13 @@
     <w:p>
       <w:pPr>
         <w:pStyle w:val="ListBullet"/>
-        <w:ind w:left="360" w:hanging="360"/>
+        <w:spacing w:before="0" w:after="20" w:line="280" w:lineRule="exact"/>
       </w:pPr>
       <w:r>
         <w:rPr>
           <w:rFonts w:ascii="Calibri" w:hAnsi="Calibri"/>
-          <w:b w:val="0"/>
-          <w:color w:val="444444"/>
-          <w:sz w:val="18"/>
+          <w:color w:val="2B2B2B"/>
+          <w:sz w:val="19"/>
         </w:rPr>
         <w:t>Built out the Snowflake data warehouse for the project and wrote the dbt and SQL transformation logic behind 50+ downstream reports.</w:t>
       </w:r>
@@ -1066,14 +1118,13 @@
     <w:p>
       <w:pPr>
         <w:pStyle w:val="ListBullet"/>
-        <w:ind w:left="360" w:hanging="360"/>
+        <w:spacing w:before="0" w:after="20" w:line="280" w:lineRule="exact"/>
       </w:pPr>
       <w:r>
         <w:rPr>
           <w:rFonts w:ascii="Calibri" w:hAnsi="Calibri"/>
-          <w:b w:val="0"/>
-          <w:color w:val="444444"/>
-          <w:sz w:val="18"/>
+          <w:color w:val="2B2B2B"/>
+          <w:sz w:val="19"/>
         </w:rPr>
         <w:t xml:space="preserve">Ran 15+ data pipelines on </w:t>
       </w:r>
@@ -1081,17 +1132,16 @@
         <w:rPr>
           <w:rFonts w:ascii="Calibri" w:hAnsi="Calibri"/>
           <w:b/>
-          <w:color w:val="444444"/>
-          <w:sz w:val="18"/>
+          <w:color w:val="2B2B2B"/>
+          <w:sz w:val="19"/>
         </w:rPr>
         <w:t>SAP BW</w:t>
       </w:r>
       <w:r>
         <w:rPr>
           <w:rFonts w:ascii="Calibri" w:hAnsi="Calibri"/>
-          <w:b w:val="0"/>
-          <w:color w:val="444444"/>
-          <w:sz w:val="18"/>
+          <w:color w:val="2B2B2B"/>
+          <w:sz w:val="19"/>
         </w:rPr>
         <w:t xml:space="preserve"> (ADSOs, DSOs, Composite Providers) and automated scheduling with Process Chains, cutting manual data prep by around 30%.</w:t>
       </w:r>
@@ -1099,14 +1149,13 @@
     <w:p>
       <w:pPr>
         <w:pStyle w:val="ListBullet"/>
-        <w:ind w:left="360" w:hanging="360"/>
+        <w:spacing w:before="0" w:after="20" w:line="280" w:lineRule="exact"/>
       </w:pPr>
       <w:r>
         <w:rPr>
           <w:rFonts w:ascii="Calibri" w:hAnsi="Calibri"/>
-          <w:b w:val="0"/>
-          <w:color w:val="444444"/>
-          <w:sz w:val="18"/>
+          <w:color w:val="2B2B2B"/>
+          <w:sz w:val="19"/>
         </w:rPr>
         <w:t xml:space="preserve">Moved legacy reports to </w:t>
       </w:r>
@@ -1114,17 +1163,16 @@
         <w:rPr>
           <w:rFonts w:ascii="Calibri" w:hAnsi="Calibri"/>
           <w:b/>
-          <w:color w:val="444444"/>
-          <w:sz w:val="18"/>
+          <w:color w:val="2B2B2B"/>
+          <w:sz w:val="19"/>
         </w:rPr>
         <w:t>SAP HANA</w:t>
       </w:r>
       <w:r>
         <w:rPr>
           <w:rFonts w:ascii="Calibri" w:hAnsi="Calibri"/>
-          <w:b w:val="0"/>
-          <w:color w:val="444444"/>
-          <w:sz w:val="18"/>
+          <w:color w:val="2B2B2B"/>
+          <w:sz w:val="19"/>
         </w:rPr>
         <w:t xml:space="preserve"> calculation views, which ran around 40% faster than the BW versions.</w:t>
       </w:r>
@@ -1132,14 +1180,13 @@
     <w:p>
       <w:pPr>
         <w:pStyle w:val="ListBullet"/>
-        <w:ind w:left="360" w:hanging="360"/>
+        <w:spacing w:before="0" w:after="20" w:line="280" w:lineRule="exact"/>
       </w:pPr>
       <w:r>
         <w:rPr>
           <w:rFonts w:ascii="Calibri" w:hAnsi="Calibri"/>
-          <w:b w:val="0"/>
-          <w:color w:val="444444"/>
-          <w:sz w:val="18"/>
+          <w:color w:val="2B2B2B"/>
+          <w:sz w:val="19"/>
         </w:rPr>
         <w:t>Built Power BI dashboards with DAX and M Query for 3 business units, replacing weekly Excel reporting.</w:t>
       </w:r>
@@ -1147,14 +1194,13 @@
     <w:p>
       <w:pPr>
         <w:pStyle w:val="ListBullet"/>
-        <w:ind w:left="360" w:hanging="360"/>
+        <w:spacing w:before="0" w:after="20" w:line="280" w:lineRule="exact"/>
       </w:pPr>
       <w:r>
         <w:rPr>
           <w:rFonts w:ascii="Calibri" w:hAnsi="Calibri"/>
-          <w:b w:val="0"/>
-          <w:color w:val="444444"/>
-          <w:sz w:val="18"/>
+          <w:color w:val="2B2B2B"/>
+          <w:sz w:val="19"/>
         </w:rPr>
         <w:t>Owned deployments across dev, QA and production. Kept 99%+ on-time delivery by watching Process Chains and fixing failures before they escalated.</w:t>
       </w:r>
@@ -1162,14 +1208,13 @@
     <w:p>
       <w:pPr>
         <w:pStyle w:val="ListBullet"/>
-        <w:ind w:left="360" w:hanging="360"/>
+        <w:spacing w:before="0" w:after="20" w:line="280" w:lineRule="exact"/>
       </w:pPr>
       <w:r>
         <w:rPr>
           <w:rFonts w:ascii="Calibri" w:hAnsi="Calibri"/>
-          <w:b w:val="0"/>
-          <w:color w:val="444444"/>
-          <w:sz w:val="18"/>
+          <w:color w:val="2B2B2B"/>
+          <w:sz w:val="19"/>
         </w:rPr>
         <w:t>Wrote data cleansing scripts to standardize 10+ source tables with inconsistent formats, which cut downstream transformation failures.</w:t>
       </w:r>
@@ -1177,125 +1222,295 @@
     <w:p>
       <w:pPr>
         <w:pStyle w:val="ListBullet"/>
-        <w:ind w:left="360" w:hanging="360"/>
+        <w:spacing w:before="0" w:after="20" w:line="280" w:lineRule="exact"/>
       </w:pPr>
       <w:r>
         <w:rPr>
           <w:rFonts w:ascii="Calibri" w:hAnsi="Calibri"/>
-          <w:b w:val="0"/>
-          <w:color w:val="444444"/>
-          <w:sz w:val="18"/>
+          <w:color w:val="2B2B2B"/>
+          <w:sz w:val="19"/>
         </w:rPr>
         <w:t>Coordinated transport management across all 3 environments, working with other teams to hit release windows.</w:t>
       </w:r>
     </w:p>
     <w:p>
       <w:pPr>
-        <w:jc w:val="center"/>
+        <w:spacing w:before="80" w:after="80"/>
       </w:pPr>
       <w:r>
         <w:rPr>
-          <w:rFonts w:ascii="Calibri" w:hAnsi="Calibri"/>
-          <w:b w:val="0"/>
-          <w:color w:val="888888"/>
-          <w:sz w:val="14"/>
+          <w:color w:val="CFCFCF"/>
+          <w:sz w:val="12"/>
         </w:rPr>
         <w:t>────────────────────────────────────────────────────────────────────────────────</w:t>
       </w:r>
     </w:p>
     <w:p>
+      <w:pPr>
+        <w:spacing w:before="40" w:after="80"/>
+      </w:pPr>
       <w:r>
         <w:rPr>
           <w:rFonts w:ascii="Calibri" w:hAnsi="Calibri"/>
           <w:b/>
-          <w:color w:val="2D2D2D"/>
-          <w:sz w:val="20"/>
+          <w:color w:val="16325C"/>
+          <w:sz w:val="22"/>
         </w:rPr>
         <w:t>CERTIFICATIONS</w:t>
       </w:r>
     </w:p>
     <w:p>
       <w:pPr>
-        <w:jc w:val="center"/>
+        <w:pStyle w:val="ListBullet"/>
+        <w:spacing w:before="0" w:after="20" w:line="280" w:lineRule="exact"/>
       </w:pPr>
       <w:r>
         <w:rPr>
           <w:rFonts w:ascii="Calibri" w:hAnsi="Calibri"/>
-          <w:b w:val="0"/>
-          <w:color w:val="888888"/>
-          <w:sz w:val="14"/>
+          <w:b/>
+          <w:color w:val="111111"/>
+          <w:sz w:val="19"/>
+        </w:rPr>
+        <w:t>SnowPro Advanced Data Architect</w:t>
+      </w:r>
+      <w:r>
+        <w:rPr>
+          <w:rFonts w:ascii="Calibri" w:hAnsi="Calibri"/>
+          <w:color w:val="2B2B2B"/>
+          <w:sz w:val="19"/>
+        </w:rPr>
+        <w:t xml:space="preserve"> - Snowflake</w:t>
+      </w:r>
+    </w:p>
+    <w:p>
+      <w:pPr>
+        <w:pStyle w:val="ListBullet"/>
+        <w:spacing w:before="0" w:after="20" w:line="280" w:lineRule="exact"/>
+      </w:pPr>
+      <w:r>
+        <w:rPr>
+          <w:rFonts w:ascii="Calibri" w:hAnsi="Calibri"/>
+          <w:b/>
+          <w:color w:val="111111"/>
+          <w:sz w:val="19"/>
+        </w:rPr>
+        <w:t>dbt Developer Certification</w:t>
+      </w:r>
+      <w:r>
+        <w:rPr>
+          <w:rFonts w:ascii="Calibri" w:hAnsi="Calibri"/>
+          <w:color w:val="2B2B2B"/>
+          <w:sz w:val="19"/>
+        </w:rPr>
+        <w:t xml:space="preserve"> - dbt Labs</w:t>
+      </w:r>
+    </w:p>
+    <w:p>
+      <w:pPr>
+        <w:pStyle w:val="ListBullet"/>
+        <w:spacing w:before="0" w:after="20" w:line="280" w:lineRule="exact"/>
+      </w:pPr>
+      <w:r>
+        <w:rPr>
+          <w:rFonts w:ascii="Calibri" w:hAnsi="Calibri"/>
+          <w:b/>
+          <w:color w:val="111111"/>
+          <w:sz w:val="19"/>
+        </w:rPr>
+        <w:t>SnowPro Advanced Data Engineer</w:t>
+      </w:r>
+      <w:r>
+        <w:rPr>
+          <w:rFonts w:ascii="Calibri" w:hAnsi="Calibri"/>
+          <w:color w:val="2B2B2B"/>
+          <w:sz w:val="19"/>
+        </w:rPr>
+        <w:t xml:space="preserve"> - Snowflake</w:t>
+      </w:r>
+    </w:p>
+    <w:p>
+      <w:pPr>
+        <w:pStyle w:val="ListBullet"/>
+        <w:spacing w:before="0" w:after="20" w:line="280" w:lineRule="exact"/>
+      </w:pPr>
+      <w:r>
+        <w:rPr>
+          <w:rFonts w:ascii="Calibri" w:hAnsi="Calibri"/>
+          <w:b/>
+          <w:color w:val="111111"/>
+          <w:sz w:val="19"/>
+        </w:rPr>
+        <w:t>SnowPro Core Certification</w:t>
+      </w:r>
+      <w:r>
+        <w:rPr>
+          <w:rFonts w:ascii="Calibri" w:hAnsi="Calibri"/>
+          <w:color w:val="2B2B2B"/>
+          <w:sz w:val="19"/>
+        </w:rPr>
+        <w:t xml:space="preserve"> - Snowflake</w:t>
+      </w:r>
+    </w:p>
+    <w:p>
+      <w:pPr>
+        <w:pStyle w:val="ListBullet"/>
+        <w:spacing w:before="0" w:after="20" w:line="280" w:lineRule="exact"/>
+      </w:pPr>
+      <w:r>
+        <w:rPr>
+          <w:rFonts w:ascii="Calibri" w:hAnsi="Calibri"/>
+          <w:b/>
+          <w:color w:val="111111"/>
+          <w:sz w:val="19"/>
+        </w:rPr>
+        <w:t>Microsoft Certified Data Analyst (DA-100)</w:t>
+      </w:r>
+      <w:r>
+        <w:rPr>
+          <w:rFonts w:ascii="Calibri" w:hAnsi="Calibri"/>
+          <w:color w:val="2B2B2B"/>
+          <w:sz w:val="19"/>
+        </w:rPr>
+        <w:t xml:space="preserve"> - Microsoft</w:t>
+      </w:r>
+    </w:p>
+    <w:p>
+      <w:pPr>
+        <w:pStyle w:val="ListBullet"/>
+        <w:spacing w:before="0" w:after="20" w:line="280" w:lineRule="exact"/>
+      </w:pPr>
+      <w:r>
+        <w:rPr>
+          <w:rFonts w:ascii="Calibri" w:hAnsi="Calibri"/>
+          <w:b/>
+          <w:color w:val="111111"/>
+          <w:sz w:val="19"/>
+        </w:rPr>
+        <w:t>Azure Data Fundamentals (DP-900)</w:t>
+      </w:r>
+      <w:r>
+        <w:rPr>
+          <w:rFonts w:ascii="Calibri" w:hAnsi="Calibri"/>
+          <w:color w:val="2B2B2B"/>
+          <w:sz w:val="19"/>
+        </w:rPr>
+        <w:t xml:space="preserve"> - Microsoft</w:t>
+      </w:r>
+    </w:p>
+    <w:p>
+      <w:pPr>
+        <w:spacing w:before="80" w:after="80"/>
+      </w:pPr>
+      <w:r>
+        <w:rPr>
+          <w:color w:val="CFCFCF"/>
+          <w:sz w:val="12"/>
         </w:rPr>
         <w:t>────────────────────────────────────────────────────────────────────────────────</w:t>
       </w:r>
     </w:p>
     <w:p>
+      <w:pPr>
+        <w:spacing w:before="40" w:after="80"/>
+      </w:pPr>
       <w:r>
         <w:rPr>
           <w:rFonts w:ascii="Calibri" w:hAnsi="Calibri"/>
           <w:b/>
-          <w:color w:val="2D2D2D"/>
-          <w:sz w:val="20"/>
+          <w:color w:val="16325C"/>
+          <w:sz w:val="22"/>
         </w:rPr>
         <w:t>EDUCATION</w:t>
       </w:r>
     </w:p>
     <w:p>
       <w:pPr>
-        <w:jc w:val="center"/>
+        <w:spacing w:before="0" w:after="40" w:line="280" w:lineRule="exact"/>
       </w:pPr>
       <w:r>
         <w:rPr>
           <w:rFonts w:ascii="Calibri" w:hAnsi="Calibri"/>
-          <w:b w:val="0"/>
-          <w:color w:val="888888"/>
-          <w:sz w:val="14"/>
+          <w:b/>
+          <w:color w:val="111111"/>
+          <w:sz w:val="19"/>
+        </w:rPr>
+        <w:t>B. Tech</w:t>
+      </w:r>
+      <w:r>
+        <w:rPr>
+          <w:rFonts w:ascii="Calibri" w:hAnsi="Calibri"/>
+          <w:color w:val="2B2B2B"/>
+          <w:sz w:val="19"/>
+        </w:rPr>
+        <w:t xml:space="preserve"> – Kalyani Government Engineering College, Kalyani, West Bengal | 2013-2017 | 7.28 DGPA</w:t>
+      </w:r>
+    </w:p>
+    <w:p>
+      <w:pPr>
+        <w:spacing w:before="0" w:after="40" w:line="280" w:lineRule="exact"/>
+      </w:pPr>
+      <w:r>
+        <w:rPr>
+          <w:rFonts w:ascii="Calibri" w:hAnsi="Calibri"/>
+          <w:b/>
+          <w:color w:val="111111"/>
+          <w:sz w:val="19"/>
+        </w:rPr>
+        <w:t>Higher Secondary</w:t>
+      </w:r>
+      <w:r>
+        <w:rPr>
+          <w:rFonts w:ascii="Calibri" w:hAnsi="Calibri"/>
+          <w:color w:val="2B2B2B"/>
+          <w:sz w:val="19"/>
+        </w:rPr>
+        <w:t xml:space="preserve"> – DAV Higher Secondary School, Asansol, West Bengal | 2011-2013 | 76%</w:t>
+      </w:r>
+    </w:p>
+    <w:p>
+      <w:pPr>
+        <w:spacing w:before="0" w:after="40" w:line="280" w:lineRule="exact"/>
+      </w:pPr>
+      <w:r>
+        <w:rPr>
+          <w:rFonts w:ascii="Calibri" w:hAnsi="Calibri"/>
+          <w:b/>
+          <w:color w:val="111111"/>
+          <w:sz w:val="19"/>
+        </w:rPr>
+        <w:t>Madhyamik (Class 10)</w:t>
+      </w:r>
+      <w:r>
+        <w:rPr>
+          <w:rFonts w:ascii="Calibri" w:hAnsi="Calibri"/>
+          <w:color w:val="2B2B2B"/>
+          <w:sz w:val="19"/>
+        </w:rPr>
+        <w:t xml:space="preserve"> – DAV Higher Secondary School, Asansol, West Bengal | 2011 | 76%</w:t>
+      </w:r>
+    </w:p>
+    <w:p>
+      <w:pPr>
+        <w:spacing w:before="80" w:after="80"/>
+      </w:pPr>
+      <w:r>
+        <w:rPr>
+          <w:color w:val="CFCFCF"/>
+          <w:sz w:val="12"/>
         </w:rPr>
         <w:t>────────────────────────────────────────────────────────────────────────────────</w:t>
       </w:r>
     </w:p>
     <w:p>
+      <w:pPr>
+        <w:spacing w:before="40" w:after="80"/>
+      </w:pPr>
       <w:r>
         <w:rPr>
           <w:rFonts w:ascii="Calibri" w:hAnsi="Calibri"/>
           <w:b/>
-          <w:color w:val="2D2D2D"/>
-          <w:sz w:val="20"/>
-        </w:rPr>
-        <w:t>LANGUAGES</w:t>
-      </w:r>
-    </w:p>
-    <w:p>
-      <w:r>
-        <w:rPr>
-          <w:rFonts w:ascii="Calibri" w:hAnsi="Calibri"/>
-          <w:b w:val="0"/>
-          <w:color w:val="444444"/>
-          <w:sz w:val="18"/>
-        </w:rPr>
-        <w:t>English, Hindi</w:t>
-      </w:r>
-    </w:p>
-    <w:p>
-      <w:pPr>
-        <w:jc w:val="center"/>
-      </w:pPr>
-      <w:r>
-        <w:rPr>
-          <w:rFonts w:ascii="Calibri" w:hAnsi="Calibri"/>
-          <w:b w:val="0"/>
-          <w:color w:val="888888"/>
-          <w:sz w:val="14"/>
-        </w:rPr>
-        <w:t>────────────────────────────────────────────────────────────────────────────────</w:t>
-      </w:r>
-    </w:p>
-    <w:p>
-      <w:r>
-        <w:rPr>
-          <w:rFonts w:ascii="Calibri" w:hAnsi="Calibri"/>
-          <w:b/>
-          <w:color w:val="2D2D2D"/>
-          <w:sz w:val="20"/>
+          <w:color w:val="16325C"/>
+          <w:sz w:val="22"/>
         </w:rPr>
         <w:t>RECOGNITION</w:t>
       </w:r>
@@ -1303,23 +1518,22 @@
     <w:p>
       <w:pPr>
         <w:pStyle w:val="ListBullet"/>
-        <w:ind w:left="360" w:hanging="360"/>
+        <w:spacing w:before="0" w:after="20" w:line="280" w:lineRule="exact"/>
       </w:pPr>
       <w:r>
         <w:rPr>
           <w:rFonts w:ascii="Calibri" w:hAnsi="Calibri"/>
           <w:b/>
-          <w:color w:val="444444"/>
-          <w:sz w:val="18"/>
+          <w:color w:val="2B2B2B"/>
+          <w:sz w:val="19"/>
         </w:rPr>
         <w:t>Star Performer Award (2x)</w:t>
       </w:r>
       <w:r>
         <w:rPr>
           <w:rFonts w:ascii="Calibri" w:hAnsi="Calibri"/>
-          <w:b w:val="0"/>
-          <w:color w:val="444444"/>
-          <w:sz w:val="18"/>
+          <w:color w:val="2B2B2B"/>
+          <w:sz w:val="19"/>
         </w:rPr>
         <w:t xml:space="preserve"> for client solution delivery</w:t>
       </w:r>
@@ -1327,23 +1541,22 @@
     <w:p>
       <w:pPr>
         <w:pStyle w:val="ListBullet"/>
-        <w:ind w:left="360" w:hanging="360"/>
+        <w:spacing w:before="0" w:after="20" w:line="280" w:lineRule="exact"/>
       </w:pPr>
       <w:r>
         <w:rPr>
           <w:rFonts w:ascii="Calibri" w:hAnsi="Calibri"/>
           <w:b/>
-          <w:color w:val="444444"/>
-          <w:sz w:val="18"/>
+          <w:color w:val="2B2B2B"/>
+          <w:sz w:val="19"/>
         </w:rPr>
         <w:t>Pinnacle Award</w:t>
       </w:r>
       <w:r>
         <w:rPr>
           <w:rFonts w:ascii="Calibri" w:hAnsi="Calibri"/>
-          <w:b w:val="0"/>
-          <w:color w:val="444444"/>
-          <w:sz w:val="18"/>
+          <w:color w:val="2B2B2B"/>
+          <w:sz w:val="19"/>
         </w:rPr>
         <w:t xml:space="preserve"> for on-time delivery and positive client feedback</w:t>
       </w:r>
@@ -1351,23 +1564,22 @@
     <w:p>
       <w:pPr>
         <w:pStyle w:val="ListBullet"/>
-        <w:ind w:left="360" w:hanging="360"/>
+        <w:spacing w:before="0" w:after="20" w:line="280" w:lineRule="exact"/>
       </w:pPr>
       <w:r>
         <w:rPr>
           <w:rFonts w:ascii="Calibri" w:hAnsi="Calibri"/>
           <w:b/>
-          <w:color w:val="444444"/>
-          <w:sz w:val="18"/>
+          <w:color w:val="2B2B2B"/>
+          <w:sz w:val="19"/>
         </w:rPr>
         <w:t>PAT ON BACK Award</w:t>
       </w:r>
       <w:r>
         <w:rPr>
           <w:rFonts w:ascii="Calibri" w:hAnsi="Calibri"/>
-          <w:b w:val="0"/>
-          <w:color w:val="444444"/>
-          <w:sz w:val="18"/>
+          <w:color w:val="2B2B2B"/>
+          <w:sz w:val="19"/>
         </w:rPr>
         <w:t xml:space="preserve"> for going above and beyond on project deadlines</w:t>
       </w:r>
@@ -1375,23 +1587,22 @@
     <w:p>
       <w:pPr>
         <w:pStyle w:val="ListBullet"/>
-        <w:ind w:left="360" w:hanging="360"/>
+        <w:spacing w:before="0" w:after="20" w:line="280" w:lineRule="exact"/>
       </w:pPr>
       <w:r>
         <w:rPr>
           <w:rFonts w:ascii="Calibri" w:hAnsi="Calibri"/>
           <w:b/>
-          <w:color w:val="444444"/>
-          <w:sz w:val="18"/>
+          <w:color w:val="2B2B2B"/>
+          <w:sz w:val="19"/>
         </w:rPr>
         <w:t>Ninja Squad (2x)</w:t>
       </w:r>
       <w:r>
         <w:rPr>
           <w:rFonts w:ascii="Calibri" w:hAnsi="Calibri"/>
-          <w:b w:val="0"/>
-          <w:color w:val="444444"/>
-          <w:sz w:val="18"/>
+          <w:color w:val="2B2B2B"/>
+          <w:sz w:val="19"/>
         </w:rPr>
         <w:t xml:space="preserve"> for technical problem-solving</w:t>
       </w:r>
@@ -1399,23 +1610,22 @@
     <w:p>
       <w:pPr>
         <w:pStyle w:val="ListBullet"/>
-        <w:ind w:left="360" w:hanging="360"/>
+        <w:spacing w:before="0" w:after="20" w:line="280" w:lineRule="exact"/>
       </w:pPr>
       <w:r>
         <w:rPr>
           <w:rFonts w:ascii="Calibri" w:hAnsi="Calibri"/>
           <w:b/>
-          <w:color w:val="444444"/>
-          <w:sz w:val="18"/>
+          <w:color w:val="2B2B2B"/>
+          <w:sz w:val="19"/>
         </w:rPr>
         <w:t>Eagle Squad</w:t>
       </w:r>
       <w:r>
         <w:rPr>
           <w:rFonts w:ascii="Calibri" w:hAnsi="Calibri"/>
-          <w:b w:val="0"/>
-          <w:color w:val="444444"/>
-          <w:sz w:val="18"/>
+          <w:color w:val="2B2B2B"/>
+          <w:sz w:val="19"/>
         </w:rPr>
         <w:t xml:space="preserve"> for consistent team delivery</w:t>
       </w:r>
@@ -1423,21 +1633,59 @@
     <w:p>
       <w:pPr>
         <w:pStyle w:val="ListBullet"/>
-        <w:ind w:left="360" w:hanging="360"/>
+        <w:spacing w:before="0" w:after="20" w:line="280" w:lineRule="exact"/>
       </w:pPr>
       <w:r>
         <w:rPr>
           <w:rFonts w:ascii="Calibri" w:hAnsi="Calibri"/>
-          <w:b w:val="0"/>
-          <w:color w:val="444444"/>
-          <w:sz w:val="18"/>
+          <w:color w:val="2B2B2B"/>
+          <w:sz w:val="19"/>
         </w:rPr>
         <w:t>Multiple client commendations for hands-on leadership</w:t>
       </w:r>
     </w:p>
+    <w:p>
+      <w:pPr>
+        <w:spacing w:before="80" w:after="80"/>
+      </w:pPr>
+      <w:r>
+        <w:rPr>
+          <w:color w:val="CFCFCF"/>
+          <w:sz w:val="12"/>
+        </w:rPr>
+        <w:t>────────────────────────────────────────────────────────────────────────────────</w:t>
+      </w:r>
+    </w:p>
+    <w:p>
+      <w:pPr>
+        <w:spacing w:before="40" w:after="80"/>
+      </w:pPr>
+      <w:r>
+        <w:rPr>
+          <w:rFonts w:ascii="Calibri" w:hAnsi="Calibri"/>
+          <w:b/>
+          <w:color w:val="16325C"/>
+          <w:sz w:val="22"/>
+        </w:rPr>
+        <w:t>LANGUAGES</w:t>
+      </w:r>
+    </w:p>
+    <w:p>
+      <w:pPr>
+        <w:spacing w:before="0" w:after="0"/>
+      </w:pPr>
+      <w:r>
+        <w:rPr>
+          <w:rFonts w:ascii="Calibri" w:hAnsi="Calibri"/>
+          <w:color w:val="2B2B2B"/>
+          <w:sz w:val="19"/>
+        </w:rPr>
+        <w:t>English, Hindi</w:t>
+      </w:r>
+    </w:p>
     <w:sectPr>
       <w:pgSz w:w="12240" w:h="15840"/>
-      <w:pgMar w:top="720" w:right="1008" w:bottom="720" w:left="1008" w:header="720" w:footer="720" w:gutter="0"/>
+      <w:pgMar w:top="720" w:right="864" w:bottom="720" w:left="864" w:header="720" w:footer="720" w:gutter="0"/>
       <w:cols w:space="720"/>
       <w:docGrid w:linePitch="360"/>
     </w:sectPr>
@@ -1808,13 +2056,6 @@
     <w:name w:val="Normal"/>
     <w:qFormat/>
     <w:rsid w:val="00FC693F"/>
-    <w:pPr>
-      <w:spacing w:after="40"/>
-    </w:pPr>
-    <w:rPr>
-      <w:rFonts w:ascii="Calibri" w:hAnsi="Calibri"/>
-      <w:sz w:val="19"/>
-    </w:rPr>
   </w:style>
   <w:style w:type="paragraph" w:styleId="Header">
     <w:name w:val="header"/>

</xml_diff>

<commit_message>
feat: add Prabhash Thakur resume files in HTML, PDF, and DOCX formats
</commit_message>
<xml_diff>
--- a/Resume/Prabhash Thakur Resume.docx
+++ b/Resume/Prabhash Thakur Resume.docx
@@ -1271,6 +1271,29 @@
           <w:color w:val="111111"/>
           <w:sz w:val="19"/>
         </w:rPr>
+        <w:t>SnowPro Specialty: Gen AI Certification</w:t>
+      </w:r>
+      <w:r>
+        <w:rPr>
+          <w:rFonts w:ascii="Calibri" w:hAnsi="Calibri"/>
+          <w:color w:val="2B2B2B"/>
+          <w:sz w:val="19"/>
+        </w:rPr>
+        <w:t xml:space="preserve"> - Snowflake</w:t>
+      </w:r>
+    </w:p>
+    <w:p>
+      <w:pPr>
+        <w:pStyle w:val="ListBullet"/>
+        <w:spacing w:before="0" w:after="20" w:line="280" w:lineRule="exact"/>
+      </w:pPr>
+      <w:r>
+        <w:rPr>
+          <w:rFonts w:ascii="Calibri" w:hAnsi="Calibri"/>
+          <w:b/>
+          <w:color w:val="111111"/>
+          <w:sz w:val="19"/>
+        </w:rPr>
         <w:t>SnowPro Advanced Data Architect</w:t>
       </w:r>
       <w:r>

</xml_diff>

<commit_message>
feat: add Astronomer Airflow 3 certification and update LinkedIn banner layout
- Added Astronomer Certification for Apache Airflow 3 Fundamentals badge to resume (HTML, PDF, DOCX) and LinkedIn banner
- Refactored LinkedIn banner layout: certifications now align along the top, contact info stays bottom-right
- Removed left-section placeholder to avoid overlap with LinkedIn profile photo
</commit_message>
<xml_diff>
--- a/Resume/Prabhash Thakur Resume.docx
+++ b/Resume/Prabhash Thakur Resume.docx
@@ -1386,6 +1386,29 @@
           <w:color w:val="111111"/>
           <w:sz w:val="19"/>
         </w:rPr>
+        <w:t>Astronomer Certification for Apache Airflow 3 Fundamentals</w:t>
+      </w:r>
+      <w:r>
+        <w:rPr>
+          <w:rFonts w:ascii="Calibri" w:hAnsi="Calibri"/>
+          <w:color w:val="2B2B2B"/>
+          <w:sz w:val="19"/>
+        </w:rPr>
+        <w:t xml:space="preserve"> - Astronomer</w:t>
+      </w:r>
+    </w:p>
+    <w:p>
+      <w:pPr>
+        <w:pStyle w:val="ListBullet"/>
+        <w:spacing w:before="0" w:after="20" w:line="280" w:lineRule="exact"/>
+      </w:pPr>
+      <w:r>
+        <w:rPr>
+          <w:rFonts w:ascii="Calibri" w:hAnsi="Calibri"/>
+          <w:b/>
+          <w:color w:val="111111"/>
+          <w:sz w:val="19"/>
+        </w:rPr>
         <w:t>Microsoft Certified Data Analyst (DA-100)</w:t>
       </w:r>
       <w:r>

</xml_diff>

<commit_message>
feat: update resume files and enhance PDF generation with new formatting options
rh-pre-commit.version: 2.3.2
rh-pre-commit.check-secrets: ENABLED
</commit_message>
<xml_diff>
--- a/Resume/Prabhash Thakur Resume.docx
+++ b/Resume/Prabhash Thakur Resume.docx
@@ -4,11 +4,12 @@
   <w:body>
     <w:p>
       <w:pPr>
+        <w:pStyle w:val="Title"/>
         <w:spacing w:before="0" w:after="0"/>
       </w:pPr>
       <w:r>
         <w:rPr>
-          <w:rFonts w:ascii="Calibri" w:hAnsi="Calibri"/>
+          <w:rFonts w:ascii="Arial" w:hAnsi="Arial"/>
           <w:b/>
           <w:color w:val="111111"/>
           <w:sz w:val="48"/>
@@ -22,12 +23,12 @@
       </w:pPr>
       <w:r>
         <w:rPr>
-          <w:rFonts w:ascii="Calibri" w:hAnsi="Calibri"/>
+          <w:rFonts w:ascii="Arial" w:hAnsi="Arial"/>
           <w:b/>
           <w:color w:val="16325C"/>
           <w:sz w:val="23"/>
         </w:rPr>
-        <w:t>Senior Lead Engineer</w:t>
+        <w:t>Senior Data Engineer | Snowflake, dbt &amp; Data Architecture</w:t>
       </w:r>
     </w:p>
     <w:p>
@@ -36,7 +37,7 @@
       </w:pPr>
       <w:r>
         <w:rPr>
-          <w:rFonts w:ascii="Calibri" w:hAnsi="Calibri"/>
+          <w:rFonts w:ascii="Arial" w:hAnsi="Arial"/>
           <w:color w:val="2B2B2B"/>
           <w:sz w:val="18"/>
         </w:rPr>
@@ -45,23 +46,13 @@
     </w:p>
     <w:p>
       <w:pPr>
-        <w:spacing w:before="80" w:after="80"/>
+        <w:pStyle w:val="Heading1"/>
+        <w:keepNext/>
+        <w:spacing w:before="160" w:after="80" w:line="280" w:lineRule="exact"/>
       </w:pPr>
       <w:r>
         <w:rPr>
-          <w:color w:val="CFCFCF"/>
-          <w:sz w:val="12"/>
-        </w:rPr>
-        <w:t>────────────────────────────────────────────────────────────────────────────────</w:t>
-      </w:r>
-    </w:p>
-    <w:p>
-      <w:pPr>
-        <w:spacing w:before="40" w:after="80"/>
-      </w:pPr>
-      <w:r>
-        <w:rPr>
-          <w:rFonts w:ascii="Calibri" w:hAnsi="Calibri"/>
+          <w:rFonts w:ascii="Arial" w:hAnsi="Arial"/>
           <w:b/>
           <w:color w:val="16325C"/>
           <w:sz w:val="22"/>
@@ -71,36 +62,26 @@
     </w:p>
     <w:p>
       <w:pPr>
-        <w:spacing w:before="0" w:after="40" w:line="280" w:lineRule="exact"/>
+        <w:spacing w:before="0" w:after="40" w:line="247" w:lineRule="exact"/>
       </w:pPr>
       <w:r>
         <w:rPr>
-          <w:rFonts w:ascii="Calibri" w:hAnsi="Calibri"/>
+          <w:rFonts w:ascii="Arial" w:hAnsi="Arial"/>
           <w:color w:val="2B2B2B"/>
           <w:sz w:val="19"/>
         </w:rPr>
-        <w:t>Data engineer with 8+ years on Snowflake and dbt, currently leading a team of 8 at KIPI.AI building a Data Mesh and Gen AI data products with Snowflake Cortex. Recent work covers RAG applications over unstructured data (PDFs, DOCX, audio transcripts) using Cortex Search, self-service analytics through Cortex Analyst, and LLM-driven enrichment pipelines with Cortex functions. Comfortable picking the right modelling approach for the problem (Data Vault, star schema, medallion), locking down access with RBAC and masking policies, and keeping Snowflake compute costs under control. Also handle architecture decisions and work directly with client stakeholders on scope and delivery. SnowPro Advanced Architect, SnowPro Advanced Engineer, SnowPro Core, and dbt Developer certified.</w:t>
+        <w:t>Snowflake and dbt specialist with 8+ years in data engineering and analytics. Experience includes client project architecture, ETL/ELT pipelines, Data Mesh, data quality and access controls.</w:t>
       </w:r>
     </w:p>
     <w:p>
       <w:pPr>
-        <w:spacing w:before="80" w:after="80"/>
+        <w:pStyle w:val="Heading1"/>
+        <w:keepNext/>
+        <w:spacing w:before="160" w:after="80" w:line="280" w:lineRule="exact"/>
       </w:pPr>
       <w:r>
         <w:rPr>
-          <w:color w:val="CFCFCF"/>
-          <w:sz w:val="12"/>
-        </w:rPr>
-        <w:t>────────────────────────────────────────────────────────────────────────────────</w:t>
-      </w:r>
-    </w:p>
-    <w:p>
-      <w:pPr>
-        <w:spacing w:before="40" w:after="80"/>
-      </w:pPr>
-      <w:r>
-        <w:rPr>
-          <w:rFonts w:ascii="Calibri" w:hAnsi="Calibri"/>
+          <w:rFonts w:ascii="Arial" w:hAnsi="Arial"/>
           <w:b/>
           <w:color w:val="16325C"/>
           <w:sz w:val="22"/>
@@ -110,20 +91,20 @@
     </w:p>
     <w:p>
       <w:pPr>
-        <w:spacing w:before="0" w:after="40" w:line="280" w:lineRule="exact"/>
+        <w:spacing w:before="0" w:after="40" w:line="247" w:lineRule="exact"/>
       </w:pPr>
       <w:r>
         <w:rPr>
-          <w:rFonts w:ascii="Calibri" w:hAnsi="Calibri"/>
+          <w:rFonts w:ascii="Arial" w:hAnsi="Arial"/>
           <w:b/>
           <w:color w:val="111111"/>
           <w:sz w:val="19"/>
         </w:rPr>
-        <w:t xml:space="preserve">Data Platform &amp; Engineering: </w:t>
+        <w:t xml:space="preserve">Data Platforms: </w:t>
       </w:r>
       <w:r>
         <w:rPr>
-          <w:rFonts w:ascii="Calibri" w:hAnsi="Calibri"/>
+          <w:rFonts w:ascii="Arial" w:hAnsi="Arial"/>
           <w:color w:val="2B2B2B"/>
           <w:sz w:val="19"/>
         </w:rPr>
@@ -132,33 +113,11 @@
     </w:p>
     <w:p>
       <w:pPr>
-        <w:spacing w:before="0" w:after="40" w:line="280" w:lineRule="exact"/>
+        <w:spacing w:before="0" w:after="40" w:line="247" w:lineRule="exact"/>
       </w:pPr>
       <w:r>
         <w:rPr>
-          <w:rFonts w:ascii="Calibri" w:hAnsi="Calibri"/>
-          <w:b/>
-          <w:color w:val="111111"/>
-          <w:sz w:val="19"/>
-        </w:rPr>
-        <w:t xml:space="preserve">Snowflake AI &amp; Gen AI: </w:t>
-      </w:r>
-      <w:r>
-        <w:rPr>
-          <w:rFonts w:ascii="Calibri" w:hAnsi="Calibri"/>
-          <w:color w:val="2B2B2B"/>
-          <w:sz w:val="19"/>
-        </w:rPr>
-        <w:t>Cortex COMPLETE, CLASSIFY_TEXT, EXTRACT_ANSWER, SENTIMENT, SUMMARIZE, TRANSLATE, AI_PARSE_DOCUMENT, Cortex Search (RAG), Cortex Analyst, Cortex Fine-Tuning, Document AI, Streamlit in Snowflake, Unstructured Data (PDF, DOCX, Audio)</w:t>
-      </w:r>
-    </w:p>
-    <w:p>
-      <w:pPr>
-        <w:spacing w:before="0" w:after="40" w:line="280" w:lineRule="exact"/>
-      </w:pPr>
-      <w:r>
-        <w:rPr>
-          <w:rFonts w:ascii="Calibri" w:hAnsi="Calibri"/>
+          <w:rFonts w:ascii="Arial" w:hAnsi="Arial"/>
           <w:b/>
           <w:color w:val="111111"/>
           <w:sz w:val="19"/>
@@ -167,20 +126,20 @@
       </w:r>
       <w:r>
         <w:rPr>
-          <w:rFonts w:ascii="Calibri" w:hAnsi="Calibri"/>
+          <w:rFonts w:ascii="Arial" w:hAnsi="Arial"/>
           <w:color w:val="2B2B2B"/>
           <w:sz w:val="19"/>
         </w:rPr>
-        <w:t>Data Mesh, Medallion Architecture, Data Vault Modeling, Dimensional Modeling, Star Schema, Data Quality Frameworks, dbt-expectations, Row-Level Security, RBAC, Dynamic Data Masking, Data Lineage, CI/CD for dbt, Azure DevOps, Git</w:t>
+        <w:t>Data Mesh, Medallion Architecture, Data Vault Modeling, Dimensional Modeling, Star Schema, Data Quality Frameworks, dbt-expectations, Row-Level Security (RLS), Role-Based Access Control (RBAC), Dynamic Data Masking, Data Governance, Data Lineage, CI/CD for dbt, Azure DevOps, Git</w:t>
       </w:r>
     </w:p>
     <w:p>
       <w:pPr>
-        <w:spacing w:before="0" w:after="40" w:line="280" w:lineRule="exact"/>
+        <w:spacing w:before="0" w:after="40" w:line="247" w:lineRule="exact"/>
       </w:pPr>
       <w:r>
         <w:rPr>
-          <w:rFonts w:ascii="Calibri" w:hAnsi="Calibri"/>
+          <w:rFonts w:ascii="Arial" w:hAnsi="Arial"/>
           <w:b/>
           <w:color w:val="111111"/>
           <w:sz w:val="19"/>
@@ -189,7 +148,7 @@
       </w:r>
       <w:r>
         <w:rPr>
-          <w:rFonts w:ascii="Calibri" w:hAnsi="Calibri"/>
+          <w:rFonts w:ascii="Arial" w:hAnsi="Arial"/>
           <w:color w:val="2B2B2B"/>
           <w:sz w:val="19"/>
         </w:rPr>
@@ -198,11 +157,11 @@
     </w:p>
     <w:p>
       <w:pPr>
-        <w:spacing w:before="0" w:after="40" w:line="280" w:lineRule="exact"/>
+        <w:spacing w:before="0" w:after="40" w:line="247" w:lineRule="exact"/>
       </w:pPr>
       <w:r>
         <w:rPr>
-          <w:rFonts w:ascii="Calibri" w:hAnsi="Calibri"/>
+          <w:rFonts w:ascii="Arial" w:hAnsi="Arial"/>
           <w:b/>
           <w:color w:val="111111"/>
           <w:sz w:val="19"/>
@@ -211,32 +170,44 @@
       </w:r>
       <w:r>
         <w:rPr>
-          <w:rFonts w:ascii="Calibri" w:hAnsi="Calibri"/>
+          <w:rFonts w:ascii="Arial" w:hAnsi="Arial"/>
           <w:color w:val="2B2B2B"/>
           <w:sz w:val="19"/>
         </w:rPr>
-        <w:t>Team Leadership (8+ engineers), Mentorship, Stakeholder Management, Sprint Planning, Delivery Planning, Cross-Functional Governance</w:t>
+        <w:t>Team Leadership, Mentoring, Stakeholder Management, Sprint Planning, Code Reviews</w:t>
       </w:r>
     </w:p>
     <w:p>
       <w:pPr>
-        <w:spacing w:before="80" w:after="80"/>
+        <w:spacing w:before="0" w:after="40" w:line="247" w:lineRule="exact"/>
       </w:pPr>
       <w:r>
         <w:rPr>
-          <w:color w:val="CFCFCF"/>
-          <w:sz w:val="12"/>
+          <w:rFonts w:ascii="Arial" w:hAnsi="Arial"/>
+          <w:b/>
+          <w:color w:val="111111"/>
+          <w:sz w:val="19"/>
         </w:rPr>
-        <w:t>────────────────────────────────────────────────────────────────────────────────</w:t>
+        <w:t xml:space="preserve">Snowflake AI: </w:t>
+      </w:r>
+      <w:r>
+        <w:rPr>
+          <w:rFonts w:ascii="Arial" w:hAnsi="Arial"/>
+          <w:color w:val="2B2B2B"/>
+          <w:sz w:val="19"/>
+        </w:rPr>
+        <w:t>Cortex Search, Cortex Analyst, Cortex Agents, Cortex LLM Functions, AI_PARSE_DOCUMENT, Document AI, Cortex Fine-Tuning, Retrieval-Augmented Generation (RAG), Streamlit in Snowflake</w:t>
       </w:r>
     </w:p>
     <w:p>
       <w:pPr>
-        <w:spacing w:before="40" w:after="80"/>
+        <w:pStyle w:val="Heading1"/>
+        <w:keepNext/>
+        <w:spacing w:before="160" w:after="80" w:line="280" w:lineRule="exact"/>
       </w:pPr>
       <w:r>
         <w:rPr>
-          <w:rFonts w:ascii="Calibri" w:hAnsi="Calibri"/>
+          <w:rFonts w:ascii="Arial" w:hAnsi="Arial"/>
           <w:b/>
           <w:color w:val="16325C"/>
           <w:sz w:val="22"/>
@@ -246,25 +217,35 @@
     </w:p>
     <w:p>
       <w:pPr>
+        <w:keepNext/>
         <w:spacing w:before="120" w:after="0"/>
       </w:pPr>
       <w:r>
         <w:rPr>
-          <w:rFonts w:ascii="Calibri" w:hAnsi="Calibri"/>
+          <w:rFonts w:ascii="Arial" w:hAnsi="Arial"/>
           <w:b/>
           <w:color w:val="111111"/>
           <w:sz w:val="21"/>
         </w:rPr>
-        <w:t>Senior Lead Engineer  |  July 2025 - Present</w:t>
+        <w:t>Senior Lead Engineer</w:t>
+      </w:r>
+      <w:r>
+        <w:rPr>
+          <w:rFonts w:ascii="Arial" w:hAnsi="Arial"/>
+          <w:color w:val="5A5A5A"/>
+          <w:sz w:val="18"/>
+        </w:rPr>
+        <w:t xml:space="preserve">  |  July 2025 - Present</w:t>
       </w:r>
     </w:p>
     <w:p>
       <w:pPr>
+        <w:keepNext/>
         <w:spacing w:before="0" w:after="40"/>
       </w:pPr>
       <w:r>
         <w:rPr>
-          <w:rFonts w:ascii="Calibri" w:hAnsi="Calibri"/>
+          <w:rFonts w:ascii="Arial" w:hAnsi="Arial"/>
           <w:b/>
           <w:color w:val="16325C"/>
           <w:sz w:val="20"/>
@@ -275,325 +256,330 @@
     <w:p>
       <w:pPr>
         <w:pStyle w:val="ListBullet"/>
-        <w:spacing w:before="0" w:after="20" w:line="280" w:lineRule="exact"/>
+        <w:keepLines/>
+        <w:pageBreakBefore w:val="0"/>
+        <w:spacing w:before="0" w:after="20" w:line="247" w:lineRule="exact"/>
       </w:pPr>
       <w:r>
         <w:rPr>
-          <w:rFonts w:ascii="Calibri" w:hAnsi="Calibri"/>
+          <w:rFonts w:ascii="Arial" w:hAnsi="Arial"/>
           <w:color w:val="2B2B2B"/>
           <w:sz w:val="19"/>
         </w:rPr>
-        <w:t xml:space="preserve">Lead a team of 8 building a </w:t>
+        <w:t xml:space="preserve">Work on Data Mesh in Snowflake as an individual contributor for KIPI's largest client, supporting data products across </w:t>
       </w:r>
       <w:r>
         <w:rPr>
-          <w:rFonts w:ascii="Calibri" w:hAnsi="Calibri"/>
+          <w:rFonts w:ascii="Arial" w:hAnsi="Arial"/>
           <w:b/>
           <w:color w:val="2B2B2B"/>
           <w:sz w:val="19"/>
         </w:rPr>
-        <w:t>Data Mesh</w:t>
+        <w:t>5+ domains</w:t>
       </w:r>
       <w:r>
         <w:rPr>
-          <w:rFonts w:ascii="Calibri" w:hAnsi="Calibri"/>
+          <w:rFonts w:ascii="Arial" w:hAnsi="Arial"/>
           <w:color w:val="2B2B2B"/>
           <w:sz w:val="19"/>
         </w:rPr>
-        <w:t xml:space="preserve"> on Snowflake for KIPI's largest client, with data products across 5+ domains used by around 200 people.</w:t>
+        <w:t xml:space="preserve"> serving </w:t>
+      </w:r>
+      <w:r>
+        <w:rPr>
+          <w:rFonts w:ascii="Arial" w:hAnsi="Arial"/>
+          <w:b/>
+          <w:color w:val="2B2B2B"/>
+          <w:sz w:val="19"/>
+        </w:rPr>
+        <w:t>around 200 users</w:t>
+      </w:r>
+      <w:r>
+        <w:rPr>
+          <w:rFonts w:ascii="Arial" w:hAnsi="Arial"/>
+          <w:color w:val="2B2B2B"/>
+          <w:sz w:val="19"/>
+        </w:rPr>
+        <w:t>.</w:t>
       </w:r>
     </w:p>
     <w:p>
       <w:pPr>
         <w:pStyle w:val="ListBullet"/>
-        <w:spacing w:before="0" w:after="20" w:line="280" w:lineRule="exact"/>
+        <w:keepLines/>
+        <w:pageBreakBefore w:val="0"/>
+        <w:spacing w:before="0" w:after="20" w:line="247" w:lineRule="exact"/>
       </w:pPr>
       <w:r>
         <w:rPr>
-          <w:rFonts w:ascii="Calibri" w:hAnsi="Calibri"/>
+          <w:rFonts w:ascii="Arial" w:hAnsi="Arial"/>
           <w:color w:val="2B2B2B"/>
           <w:sz w:val="19"/>
         </w:rPr>
-        <w:t xml:space="preserve">Built a </w:t>
+        <w:t xml:space="preserve">Cut ingestion compute costs by </w:t>
       </w:r>
       <w:r>
         <w:rPr>
-          <w:rFonts w:ascii="Calibri" w:hAnsi="Calibri"/>
+          <w:rFonts w:ascii="Arial" w:hAnsi="Arial"/>
           <w:b/>
           <w:color w:val="2B2B2B"/>
           <w:sz w:val="19"/>
         </w:rPr>
-        <w:t>RAG-based Q&amp;A chatbot</w:t>
+        <w:t>60%</w:t>
       </w:r>
       <w:r>
         <w:rPr>
-          <w:rFonts w:ascii="Calibri" w:hAnsi="Calibri"/>
+          <w:rFonts w:ascii="Arial" w:hAnsi="Arial"/>
           <w:color w:val="2B2B2B"/>
           <w:sz w:val="19"/>
         </w:rPr>
-        <w:t xml:space="preserve">. Used </w:t>
+        <w:t xml:space="preserve"> for </w:t>
       </w:r>
       <w:r>
         <w:rPr>
-          <w:rFonts w:ascii="Calibri" w:hAnsi="Calibri"/>
+          <w:rFonts w:ascii="Arial" w:hAnsi="Arial"/>
           <w:b/>
           <w:color w:val="2B2B2B"/>
           <w:sz w:val="19"/>
         </w:rPr>
-        <w:t>AI_PARSE_DOCUMENT</w:t>
+        <w:t>over 1 TB daily</w:t>
       </w:r>
       <w:r>
         <w:rPr>
-          <w:rFonts w:ascii="Calibri" w:hAnsi="Calibri"/>
+          <w:rFonts w:ascii="Arial" w:hAnsi="Arial"/>
           <w:color w:val="2B2B2B"/>
           <w:sz w:val="19"/>
         </w:rPr>
-        <w:t xml:space="preserve"> to pull text out of PDFs, DOCX files and audio transcripts, chunked and indexed it into Cortex Search, and used Cortex COMPLETE to generate the answers. Shipped as a Streamlit app in Snowflake. Query resolution went from hours to seconds and new joiners get up to speed faster.</w:t>
+        <w:t xml:space="preserve"> through incremental loads, micro-batching and revised slowly changing dimension (SCD) Type 2 logic, moving from an L to an </w:t>
+      </w:r>
+      <w:r>
+        <w:rPr>
+          <w:rFonts w:ascii="Arial" w:hAnsi="Arial"/>
+          <w:b/>
+          <w:color w:val="2B2B2B"/>
+          <w:sz w:val="19"/>
+        </w:rPr>
+        <w:t>XS warehouse</w:t>
+      </w:r>
+      <w:r>
+        <w:rPr>
+          <w:rFonts w:ascii="Arial" w:hAnsi="Arial"/>
+          <w:color w:val="2B2B2B"/>
+          <w:sz w:val="19"/>
+        </w:rPr>
+        <w:t>.</w:t>
       </w:r>
     </w:p>
     <w:p>
       <w:pPr>
         <w:pStyle w:val="ListBullet"/>
-        <w:spacing w:before="0" w:after="20" w:line="280" w:lineRule="exact"/>
+        <w:keepLines/>
+        <w:pageBreakBefore w:val="0"/>
+        <w:spacing w:before="0" w:after="20" w:line="247" w:lineRule="exact"/>
       </w:pPr>
       <w:r>
         <w:rPr>
-          <w:rFonts w:ascii="Calibri" w:hAnsi="Calibri"/>
+          <w:rFonts w:ascii="Arial" w:hAnsi="Arial"/>
           <w:color w:val="2B2B2B"/>
           <w:sz w:val="19"/>
         </w:rPr>
-        <w:t>Automated classification of 50K+ customer feedback records a month coming from free-text survey responses, support emails and call recordings. Added Cortex LLM functions (CLASSIFY_TEXT, SENTIMENT, EXTRACT_ANSWER) into the enrichment pipeline, which freed up 3 people and turned a weeks-long backlog into same-day output.</w:t>
+        <w:t xml:space="preserve">Wrote dbt macros to purge stale snapshots automatically, cutting storage and processing overhead by </w:t>
+      </w:r>
+      <w:r>
+        <w:rPr>
+          <w:rFonts w:ascii="Arial" w:hAnsi="Arial"/>
+          <w:b/>
+          <w:color w:val="2B2B2B"/>
+          <w:sz w:val="19"/>
+        </w:rPr>
+        <w:t>around 40%</w:t>
+      </w:r>
+      <w:r>
+        <w:rPr>
+          <w:rFonts w:ascii="Arial" w:hAnsi="Arial"/>
+          <w:color w:val="2B2B2B"/>
+          <w:sz w:val="19"/>
+        </w:rPr>
+        <w:t>.</w:t>
       </w:r>
     </w:p>
     <w:p>
       <w:pPr>
         <w:pStyle w:val="ListBullet"/>
-        <w:spacing w:before="0" w:after="20" w:line="280" w:lineRule="exact"/>
+        <w:keepLines/>
+        <w:pageBreakBefore w:val="0"/>
+        <w:spacing w:before="0" w:after="20" w:line="247" w:lineRule="exact"/>
       </w:pPr>
       <w:r>
         <w:rPr>
-          <w:rFonts w:ascii="Calibri" w:hAnsi="Calibri"/>
+          <w:rFonts w:ascii="Arial" w:hAnsi="Arial"/>
           <w:color w:val="2B2B2B"/>
           <w:sz w:val="19"/>
         </w:rPr>
-        <w:t xml:space="preserve">Set up </w:t>
-      </w:r>
-      <w:r>
-        <w:rPr>
-          <w:rFonts w:ascii="Calibri" w:hAnsi="Calibri"/>
-          <w:b/>
-          <w:color w:val="2B2B2B"/>
-          <w:sz w:val="19"/>
-        </w:rPr>
-        <w:t>Cortex Analyst</w:t>
-      </w:r>
-      <w:r>
-        <w:rPr>
-          <w:rFonts w:ascii="Calibri" w:hAnsi="Calibri"/>
-          <w:color w:val="2B2B2B"/>
-          <w:sz w:val="19"/>
-        </w:rPr>
-        <w:t xml:space="preserve"> so business users could ask questions in plain English instead of raising SQL requests. Ad-hoc report requests dropped by around 40%.</w:t>
+        <w:t>Established coding standards, pull request reviews, Git branching rules and naming conventions.</w:t>
       </w:r>
     </w:p>
     <w:p>
       <w:pPr>
         <w:pStyle w:val="ListBullet"/>
-        <w:spacing w:before="0" w:after="20" w:line="280" w:lineRule="exact"/>
+        <w:keepLines/>
+        <w:pageBreakBefore w:val="0"/>
+        <w:spacing w:before="0" w:after="20" w:line="247" w:lineRule="exact"/>
       </w:pPr>
       <w:r>
         <w:rPr>
-          <w:rFonts w:ascii="Calibri" w:hAnsi="Calibri"/>
+          <w:rFonts w:ascii="Arial" w:hAnsi="Arial"/>
           <w:color w:val="2B2B2B"/>
           <w:sz w:val="19"/>
         </w:rPr>
-        <w:t xml:space="preserve">Used </w:t>
+        <w:t xml:space="preserve">Applied Snowflake </w:t>
       </w:r>
       <w:r>
         <w:rPr>
-          <w:rFonts w:ascii="Calibri" w:hAnsi="Calibri"/>
+          <w:rFonts w:ascii="Arial" w:hAnsi="Arial"/>
           <w:b/>
           <w:color w:val="2B2B2B"/>
           <w:sz w:val="19"/>
         </w:rPr>
-        <w:t>Document AI</w:t>
+        <w:t>Row-Level Security (RLS)</w:t>
       </w:r>
       <w:r>
         <w:rPr>
-          <w:rFonts w:ascii="Calibri" w:hAnsi="Calibri"/>
+          <w:rFonts w:ascii="Arial" w:hAnsi="Arial"/>
           <w:color w:val="2B2B2B"/>
           <w:sz w:val="19"/>
         </w:rPr>
-        <w:t xml:space="preserve"> to pull amounts, dates, vendor names and line items out of vendor invoices and contracts, feeding straight into the finance data product. Cut roughly 20 hours a week of manual data entry and sped up accounts payable processing.</w:t>
+        <w:t xml:space="preserve"> and developed a personally identifiable information (PII) scanner to flag missing RLS or masking policies across data products and alert domain owners.</w:t>
       </w:r>
     </w:p>
     <w:p>
       <w:pPr>
         <w:pStyle w:val="ListBullet"/>
-        <w:spacing w:before="0" w:after="20" w:line="280" w:lineRule="exact"/>
+        <w:keepLines/>
+        <w:pageBreakBefore w:val="0"/>
+        <w:spacing w:before="0" w:after="20" w:line="247" w:lineRule="exact"/>
       </w:pPr>
       <w:r>
         <w:rPr>
-          <w:rFonts w:ascii="Calibri" w:hAnsi="Calibri"/>
+          <w:rFonts w:ascii="Arial" w:hAnsi="Arial"/>
           <w:color w:val="2B2B2B"/>
           <w:sz w:val="19"/>
         </w:rPr>
-        <w:t xml:space="preserve">Fine-tuned a base LLM with </w:t>
+        <w:t xml:space="preserve">Created a </w:t>
       </w:r>
       <w:r>
         <w:rPr>
-          <w:rFonts w:ascii="Calibri" w:hAnsi="Calibri"/>
+          <w:rFonts w:ascii="Arial" w:hAnsi="Arial"/>
           <w:b/>
           <w:color w:val="2B2B2B"/>
           <w:sz w:val="19"/>
         </w:rPr>
-        <w:t>Cortex Fine-Tuning</w:t>
+        <w:t>dbt audit package</w:t>
       </w:r>
       <w:r>
         <w:rPr>
-          <w:rFonts w:ascii="Calibri" w:hAnsi="Calibri"/>
+          <w:rFonts w:ascii="Arial" w:hAnsi="Arial"/>
           <w:color w:val="2B2B2B"/>
           <w:sz w:val="19"/>
         </w:rPr>
-        <w:t xml:space="preserve"> on client-specific labels, which improved classification accuracy by around 15% over the out-of-the-box model.</w:t>
+        <w:t xml:space="preserve"> from scratch with metadata discovery, batched SQL checks, pass/fail results and 90-day retention to flag Snowflake account data missing row access policies.</w:t>
       </w:r>
     </w:p>
     <w:p>
       <w:pPr>
         <w:pStyle w:val="ListBullet"/>
-        <w:spacing w:before="0" w:after="20" w:line="280" w:lineRule="exact"/>
+        <w:keepLines/>
+        <w:pageBreakBefore w:val="0"/>
+        <w:spacing w:before="0" w:after="20" w:line="247" w:lineRule="exact"/>
       </w:pPr>
       <w:r>
         <w:rPr>
-          <w:rFonts w:ascii="Calibri" w:hAnsi="Calibri"/>
+          <w:rFonts w:ascii="Arial" w:hAnsi="Arial"/>
           <w:color w:val="2B2B2B"/>
           <w:sz w:val="19"/>
         </w:rPr>
-        <w:t>Cut compute cost on the main ingestion pipeline by 60%. Moved it to incremental loads with micro-batching and rewrote the SCD2 logic so it runs on an XS warehouse instead of an L, on over 1TB a day.</w:t>
+        <w:t>Implemented the dbt-expectations data quality layer and continue to expand governance as new domains join.</w:t>
       </w:r>
     </w:p>
     <w:p>
       <w:pPr>
         <w:pStyle w:val="ListBullet"/>
-        <w:spacing w:before="0" w:after="20" w:line="280" w:lineRule="exact"/>
+        <w:keepLines/>
+        <w:pageBreakBefore w:val="0"/>
+        <w:spacing w:before="0" w:after="20" w:line="247" w:lineRule="exact"/>
       </w:pPr>
       <w:r>
         <w:rPr>
-          <w:rFonts w:ascii="Calibri" w:hAnsi="Calibri"/>
+          <w:rFonts w:ascii="Arial" w:hAnsi="Arial"/>
           <w:color w:val="2B2B2B"/>
           <w:sz w:val="19"/>
         </w:rPr>
-        <w:t>Wrote macros that purge stale snapshots automatically, cutting storage and processing overhead by around 40%.</w:t>
+        <w:t>Run weekly code walkthroughs and sessions on architecture and development practices.</w:t>
       </w:r>
     </w:p>
     <w:p>
       <w:pPr>
         <w:pStyle w:val="ListBullet"/>
-        <w:spacing w:before="0" w:after="20" w:line="280" w:lineRule="exact"/>
+        <w:keepLines/>
+        <w:pageBreakBefore w:val="0"/>
+        <w:spacing w:before="0" w:after="20" w:line="247" w:lineRule="exact"/>
       </w:pPr>
       <w:r>
         <w:rPr>
-          <w:rFonts w:ascii="Calibri" w:hAnsi="Calibri"/>
+          <w:rFonts w:ascii="Arial" w:hAnsi="Arial"/>
           <w:color w:val="2B2B2B"/>
           <w:sz w:val="19"/>
         </w:rPr>
-        <w:t>Set up coding standards, PR review process, branching strategy and naming conventions. None of this was consistent before I joined.</w:t>
+        <w:t>Used Cortex Search and COMPLETE for RAG Q&amp;A, and Document AI and AI_PARSE_DOCUMENT for extraction.</w:t>
       </w:r>
     </w:p>
     <w:p>
       <w:pPr>
         <w:pStyle w:val="ListBullet"/>
-        <w:spacing w:before="0" w:after="20" w:line="280" w:lineRule="exact"/>
+        <w:keepLines/>
+        <w:pageBreakBefore w:val="0"/>
+        <w:spacing w:before="0" w:after="20" w:line="247" w:lineRule="exact"/>
       </w:pPr>
       <w:r>
         <w:rPr>
-          <w:rFonts w:ascii="Calibri" w:hAnsi="Calibri"/>
+          <w:rFonts w:ascii="Arial" w:hAnsi="Arial"/>
           <w:color w:val="2B2B2B"/>
           <w:sz w:val="19"/>
         </w:rPr>
-        <w:t>Built a PII scanner that checks every data product for missing Row-Level Security or masking policies and alerts the domain owner when it finds a gap.</w:t>
+        <w:t>Worked with Cortex Analyst for natural-language queries, Cortex LLM functions for classification, sentiment analysis and information extraction, and Cortex Fine-Tuning for model customization.</w:t>
       </w:r>
     </w:p>
     <w:p>
       <w:pPr>
-        <w:pStyle w:val="ListBullet"/>
-        <w:spacing w:before="0" w:after="20" w:line="280" w:lineRule="exact"/>
+        <w:keepNext/>
+        <w:spacing w:before="120" w:after="0"/>
       </w:pPr>
       <w:r>
         <w:rPr>
-          <w:rFonts w:ascii="Calibri" w:hAnsi="Calibri"/>
-          <w:color w:val="2B2B2B"/>
-          <w:sz w:val="19"/>
+          <w:rFonts w:ascii="Arial" w:hAnsi="Arial"/>
+          <w:b/>
+          <w:color w:val="111111"/>
+          <w:sz w:val="21"/>
         </w:rPr>
-        <w:t xml:space="preserve">Built the data quality layer with </w:t>
+        <w:t>Senior Technical Lead</w:t>
       </w:r>
       <w:r>
         <w:rPr>
-          <w:rFonts w:ascii="Calibri" w:hAnsi="Calibri"/>
-          <w:b/>
-          <w:color w:val="2B2B2B"/>
-          <w:sz w:val="19"/>
+          <w:rFonts w:ascii="Arial" w:hAnsi="Arial"/>
+          <w:color w:val="5A5A5A"/>
+          <w:sz w:val="18"/>
         </w:rPr>
-        <w:t>dbt-expectations</w:t>
-      </w:r>
-      <w:r>
-        <w:rPr>
-          <w:rFonts w:ascii="Calibri" w:hAnsi="Calibri"/>
-          <w:color w:val="2B2B2B"/>
-          <w:sz w:val="19"/>
-        </w:rPr>
-        <w:t xml:space="preserve"> and am putting together a wider governance framework so quality holds up as new domains come on.</w:t>
+        <w:t xml:space="preserve">  |  June 2023 - July 2025</w:t>
       </w:r>
     </w:p>
     <w:p>
       <w:pPr>
-        <w:pStyle w:val="ListBullet"/>
-        <w:spacing w:before="0" w:after="20" w:line="280" w:lineRule="exact"/>
-      </w:pPr>
-      <w:r>
-        <w:rPr>
-          <w:rFonts w:ascii="Calibri" w:hAnsi="Calibri"/>
-          <w:color w:val="2B2B2B"/>
-          <w:sz w:val="19"/>
-        </w:rPr>
-        <w:t>Run weekly sessions with the team on code walkthroughs, architecture and practices.</w:t>
-      </w:r>
-    </w:p>
-    <w:p>
-      <w:pPr>
-        <w:pStyle w:val="ListBullet"/>
-        <w:spacing w:before="0" w:after="20" w:line="280" w:lineRule="exact"/>
-      </w:pPr>
-      <w:r>
-        <w:rPr>
-          <w:rFonts w:ascii="Calibri" w:hAnsi="Calibri"/>
-          <w:color w:val="2B2B2B"/>
-          <w:sz w:val="19"/>
-        </w:rPr>
-        <w:t>Main point of contact for 3 client stakeholder groups. Handle sprint planning, backlog grooming and delivery timelines.</w:t>
-      </w:r>
-    </w:p>
-    <w:p>
-      <w:pPr>
-        <w:spacing w:before="120" w:after="0"/>
-      </w:pPr>
-      <w:r>
-        <w:rPr>
-          <w:rFonts w:ascii="Calibri" w:hAnsi="Calibri"/>
-          <w:b/>
-          <w:color w:val="111111"/>
-          <w:sz w:val="21"/>
-        </w:rPr>
-        <w:t>Senior Technical Lead  |  June 2023 - July 2025</w:t>
-      </w:r>
-    </w:p>
-    <w:p>
-      <w:pPr>
+        <w:keepNext/>
         <w:spacing w:before="0" w:after="40"/>
       </w:pPr>
       <w:r>
         <w:rPr>
-          <w:rFonts w:ascii="Calibri" w:hAnsi="Calibri"/>
+          <w:rFonts w:ascii="Arial" w:hAnsi="Arial"/>
           <w:b/>
           <w:color w:val="16325C"/>
           <w:sz w:val="20"/>
@@ -604,246 +590,211 @@
     <w:p>
       <w:pPr>
         <w:pStyle w:val="ListBullet"/>
-        <w:spacing w:before="0" w:after="20" w:line="280" w:lineRule="exact"/>
+        <w:keepLines/>
+        <w:pageBreakBefore w:val="0"/>
+        <w:spacing w:before="0" w:after="20" w:line="247" w:lineRule="exact"/>
       </w:pPr>
       <w:r>
         <w:rPr>
-          <w:rFonts w:ascii="Calibri" w:hAnsi="Calibri"/>
+          <w:rFonts w:ascii="Arial" w:hAnsi="Arial"/>
           <w:color w:val="2B2B2B"/>
           <w:sz w:val="19"/>
         </w:rPr>
-        <w:t>Led 8+ engineers on Snowflake migrations and new builds for enterprise clients.</w:t>
+        <w:t xml:space="preserve">Designed </w:t>
+      </w:r>
+      <w:r>
+        <w:rPr>
+          <w:rFonts w:ascii="Arial" w:hAnsi="Arial"/>
+          <w:b/>
+          <w:color w:val="2B2B2B"/>
+          <w:sz w:val="19"/>
+        </w:rPr>
+        <w:t>three client project architectures</w:t>
+      </w:r>
+      <w:r>
+        <w:rPr>
+          <w:rFonts w:ascii="Arial" w:hAnsi="Arial"/>
+          <w:color w:val="2B2B2B"/>
+          <w:sz w:val="19"/>
+        </w:rPr>
+        <w:t>: logistics on Snowflake, a Databricks project and a pet insurance project.</w:t>
       </w:r>
     </w:p>
     <w:p>
       <w:pPr>
         <w:pStyle w:val="ListBullet"/>
-        <w:spacing w:before="0" w:after="20" w:line="280" w:lineRule="exact"/>
+        <w:keepLines/>
+        <w:pageBreakBefore w:val="0"/>
+        <w:spacing w:before="0" w:after="20" w:line="247" w:lineRule="exact"/>
       </w:pPr>
       <w:r>
         <w:rPr>
-          <w:rFonts w:ascii="Calibri" w:hAnsi="Calibri"/>
+          <w:rFonts w:ascii="Arial" w:hAnsi="Arial"/>
           <w:color w:val="2B2B2B"/>
           <w:sz w:val="19"/>
         </w:rPr>
-        <w:t xml:space="preserve">Brought </w:t>
-      </w:r>
-      <w:r>
-        <w:rPr>
-          <w:rFonts w:ascii="Calibri" w:hAnsi="Calibri"/>
-          <w:b/>
-          <w:color w:val="2B2B2B"/>
-          <w:sz w:val="19"/>
-        </w:rPr>
-        <w:t>dbt</w:t>
-      </w:r>
-      <w:r>
-        <w:rPr>
-          <w:rFonts w:ascii="Calibri" w:hAnsi="Calibri"/>
-          <w:color w:val="2B2B2B"/>
-          <w:sz w:val="19"/>
-        </w:rPr>
-        <w:t xml:space="preserve"> into client projects from nothing. Set up the project structure, wrote the standards documentation and built CI/CD through Azure DevOps for clients who had never used dbt.</w:t>
+        <w:t>Delivered a Snowflake migration for a logistics company and led the client project team.</w:t>
       </w:r>
     </w:p>
     <w:p>
       <w:pPr>
         <w:pStyle w:val="ListBullet"/>
-        <w:spacing w:before="0" w:after="20" w:line="280" w:lineRule="exact"/>
+        <w:keepLines/>
+        <w:pageBreakBefore w:val="0"/>
+        <w:spacing w:before="0" w:after="20" w:line="247" w:lineRule="exact"/>
       </w:pPr>
       <w:r>
         <w:rPr>
-          <w:rFonts w:ascii="Calibri" w:hAnsi="Calibri"/>
+          <w:rFonts w:ascii="Arial" w:hAnsi="Arial"/>
           <w:color w:val="2B2B2B"/>
           <w:sz w:val="19"/>
         </w:rPr>
-        <w:t xml:space="preserve">Designed ETL/ELT pipelines on Snowflake using </w:t>
-      </w:r>
-      <w:r>
-        <w:rPr>
-          <w:rFonts w:ascii="Calibri" w:hAnsi="Calibri"/>
-          <w:b/>
-          <w:color w:val="2B2B2B"/>
-          <w:sz w:val="19"/>
-        </w:rPr>
-        <w:t>medallion architecture</w:t>
-      </w:r>
-      <w:r>
-        <w:rPr>
-          <w:rFonts w:ascii="Calibri" w:hAnsi="Calibri"/>
-          <w:color w:val="2B2B2B"/>
-          <w:sz w:val="19"/>
-        </w:rPr>
-        <w:t xml:space="preserve"> (bronze/silver/gold) and star schema modelling, turning raw data into datasets analysts could use directly.</w:t>
+        <w:t>Implemented dbt from scratch and designed its transformation architecture.</w:t>
       </w:r>
     </w:p>
     <w:p>
       <w:pPr>
         <w:pStyle w:val="ListBullet"/>
-        <w:spacing w:before="0" w:after="20" w:line="280" w:lineRule="exact"/>
+        <w:keepLines/>
+        <w:pageBreakBefore w:val="0"/>
+        <w:spacing w:before="0" w:after="20" w:line="247" w:lineRule="exact"/>
       </w:pPr>
       <w:r>
         <w:rPr>
-          <w:rFonts w:ascii="Calibri" w:hAnsi="Calibri"/>
+          <w:rFonts w:ascii="Arial" w:hAnsi="Arial"/>
           <w:color w:val="2B2B2B"/>
           <w:sz w:val="19"/>
         </w:rPr>
-        <w:t xml:space="preserve">Built </w:t>
-      </w:r>
-      <w:r>
-        <w:rPr>
-          <w:rFonts w:ascii="Calibri" w:hAnsi="Calibri"/>
-          <w:b/>
-          <w:color w:val="2B2B2B"/>
-          <w:sz w:val="19"/>
-        </w:rPr>
-        <w:t>ADF pipelines</w:t>
-      </w:r>
-      <w:r>
-        <w:rPr>
-          <w:rFonts w:ascii="Calibri" w:hAnsi="Calibri"/>
-          <w:color w:val="2B2B2B"/>
-          <w:sz w:val="19"/>
-        </w:rPr>
-        <w:t xml:space="preserve"> with dynamic schema detection that created Snowflake stages and tables on their own, so nobody had to hand-write DDL for each new source.</w:t>
+        <w:t>Developed Snowflake and dbt ETL pipelines with Azure Data Factory (ADF) to extract source data and automate stage and table creation.</w:t>
       </w:r>
     </w:p>
     <w:p>
       <w:pPr>
         <w:pStyle w:val="ListBullet"/>
-        <w:spacing w:before="0" w:after="20" w:line="280" w:lineRule="exact"/>
+        <w:keepLines/>
+        <w:pageBreakBefore w:val="0"/>
+        <w:spacing w:before="0" w:after="20" w:line="247" w:lineRule="exact"/>
       </w:pPr>
       <w:r>
         <w:rPr>
-          <w:rFonts w:ascii="Calibri" w:hAnsi="Calibri"/>
+          <w:rFonts w:ascii="Arial" w:hAnsi="Arial"/>
           <w:color w:val="2B2B2B"/>
           <w:sz w:val="19"/>
         </w:rPr>
-        <w:t>Wrote JavaScript stored procedures in Snowflake to set up stages and Snowpipes from config table entries.</w:t>
+        <w:t>Wrote dbt macros for failed-model error logs and insert/update timestamps, plus relationship tests for referential integrity.</w:t>
       </w:r>
     </w:p>
     <w:p>
       <w:pPr>
         <w:pStyle w:val="ListBullet"/>
-        <w:spacing w:before="0" w:after="20" w:line="280" w:lineRule="exact"/>
+        <w:keepLines/>
+        <w:pageBreakBefore/>
+        <w:spacing w:before="0" w:after="20" w:line="247" w:lineRule="exact"/>
       </w:pPr>
       <w:r>
         <w:rPr>
-          <w:rFonts w:ascii="Calibri" w:hAnsi="Calibri"/>
+          <w:rFonts w:ascii="Arial" w:hAnsi="Arial"/>
           <w:color w:val="2B2B2B"/>
           <w:sz w:val="19"/>
         </w:rPr>
-        <w:t xml:space="preserve">Set up </w:t>
-      </w:r>
-      <w:r>
-        <w:rPr>
-          <w:rFonts w:ascii="Calibri" w:hAnsi="Calibri"/>
-          <w:b/>
-          <w:color w:val="2B2B2B"/>
-          <w:sz w:val="19"/>
-        </w:rPr>
-        <w:t>Secure Data Sharing</w:t>
-      </w:r>
-      <w:r>
-        <w:rPr>
-          <w:rFonts w:ascii="Calibri" w:hAnsi="Calibri"/>
-          <w:color w:val="2B2B2B"/>
-          <w:sz w:val="19"/>
-        </w:rPr>
-        <w:t xml:space="preserve"> for cross-organization distribution, plus RBAC, dynamic masking and tag-based masking on sensitive columns.</w:t>
+        <w:t>Automated stage and pipe creation through Snowflake JavaScript procedures using configuration entries.</w:t>
       </w:r>
     </w:p>
     <w:p>
       <w:pPr>
         <w:pStyle w:val="ListBullet"/>
-        <w:spacing w:before="0" w:after="20" w:line="280" w:lineRule="exact"/>
+        <w:keepLines/>
+        <w:pageBreakBefore w:val="0"/>
+        <w:spacing w:before="0" w:after="20" w:line="247" w:lineRule="exact"/>
       </w:pPr>
       <w:r>
         <w:rPr>
-          <w:rFonts w:ascii="Calibri" w:hAnsi="Calibri"/>
+          <w:rFonts w:ascii="Arial" w:hAnsi="Arial"/>
           <w:color w:val="2B2B2B"/>
           <w:sz w:val="19"/>
         </w:rPr>
-        <w:t>Wrote reusable macros for error logging on failed dbt models and for handling insert and update timestamps consistently across projects.</w:t>
+        <w:t>Redesigned ADF extraction pipelines for simpler, more flexible processing.</w:t>
       </w:r>
     </w:p>
     <w:p>
       <w:pPr>
         <w:pStyle w:val="ListBullet"/>
-        <w:spacing w:before="0" w:after="20" w:line="280" w:lineRule="exact"/>
+        <w:keepLines/>
+        <w:pageBreakBefore w:val="0"/>
+        <w:spacing w:before="0" w:after="20" w:line="247" w:lineRule="exact"/>
       </w:pPr>
       <w:r>
         <w:rPr>
-          <w:rFonts w:ascii="Calibri" w:hAnsi="Calibri"/>
+          <w:rFonts w:ascii="Arial" w:hAnsi="Arial"/>
           <w:color w:val="2B2B2B"/>
           <w:sz w:val="19"/>
         </w:rPr>
-        <w:t>Wrote custom dbt tests for referential integrity and source-to-target row count checks.</w:t>
+        <w:t>Configured Snowflake shares for vendors and created export tasks.</w:t>
       </w:r>
     </w:p>
     <w:p>
       <w:pPr>
         <w:pStyle w:val="ListBullet"/>
-        <w:spacing w:before="0" w:after="20" w:line="280" w:lineRule="exact"/>
+        <w:keepLines/>
+        <w:pageBreakBefore w:val="0"/>
+        <w:spacing w:before="0" w:after="20" w:line="247" w:lineRule="exact"/>
       </w:pPr>
       <w:r>
         <w:rPr>
-          <w:rFonts w:ascii="Calibri" w:hAnsi="Calibri"/>
+          <w:rFonts w:ascii="Arial" w:hAnsi="Arial"/>
           <w:color w:val="2B2B2B"/>
           <w:sz w:val="19"/>
         </w:rPr>
-        <w:t>Ran internal Snowflake and dbt training for 20+ engineers and led the Snowflake practice POC for Beyond Key.</w:t>
+        <w:t>Led an internal proof of concept for Beyond Key's Snowflake practice and delivered internal Snowflake and dbt training.</w:t>
       </w:r>
     </w:p>
     <w:p>
       <w:pPr>
         <w:pStyle w:val="ListBullet"/>
-        <w:spacing w:before="0" w:after="20" w:line="280" w:lineRule="exact"/>
+        <w:keepLines/>
+        <w:pageBreakBefore w:val="0"/>
+        <w:spacing w:before="0" w:after="20" w:line="247" w:lineRule="exact"/>
       </w:pPr>
       <w:r>
         <w:rPr>
-          <w:rFonts w:ascii="Calibri" w:hAnsi="Calibri"/>
+          <w:rFonts w:ascii="Arial" w:hAnsi="Arial"/>
           <w:color w:val="2B2B2B"/>
           <w:sz w:val="19"/>
         </w:rPr>
-        <w:t>Rebuilt an existing ADF extraction pipeline into a modular design so the team could add new sources without touching core logic.</w:t>
+        <w:t>Learned and tested Cortex Search, Cortex Analyst and Cortex Agents.</w:t>
       </w:r>
     </w:p>
     <w:p>
       <w:pPr>
-        <w:pStyle w:val="ListBullet"/>
-        <w:spacing w:before="0" w:after="20" w:line="280" w:lineRule="exact"/>
+        <w:keepNext/>
+        <w:spacing w:before="120" w:after="0"/>
       </w:pPr>
       <w:r>
         <w:rPr>
-          <w:rFonts w:ascii="Calibri" w:hAnsi="Calibri"/>
-          <w:color w:val="2B2B2B"/>
-          <w:sz w:val="19"/>
+          <w:rFonts w:ascii="Arial" w:hAnsi="Arial"/>
+          <w:b/>
+          <w:color w:val="111111"/>
+          <w:sz w:val="21"/>
         </w:rPr>
-        <w:t>Built export tasks to push data out of Snowflake to downstream consumers.</w:t>
+        <w:t>Senior Data Engineer</w:t>
+      </w:r>
+      <w:r>
+        <w:rPr>
+          <w:rFonts w:ascii="Arial" w:hAnsi="Arial"/>
+          <w:color w:val="5A5A5A"/>
+          <w:sz w:val="18"/>
+        </w:rPr>
+        <w:t xml:space="preserve">  |  June 2021 - June 2023</w:t>
       </w:r>
     </w:p>
     <w:p>
       <w:pPr>
-        <w:spacing w:before="120" w:after="0"/>
-      </w:pPr>
-      <w:r>
-        <w:rPr>
-          <w:rFonts w:ascii="Calibri" w:hAnsi="Calibri"/>
-          <w:b/>
-          <w:color w:val="111111"/>
-          <w:sz w:val="21"/>
-        </w:rPr>
-        <w:t>Senior Data Engineer  |  June 2021 - June 2023</w:t>
-      </w:r>
-    </w:p>
-    <w:p>
-      <w:pPr>
+        <w:keepNext/>
         <w:spacing w:before="0" w:after="40"/>
       </w:pPr>
       <w:r>
         <w:rPr>
-          <w:rFonts w:ascii="Calibri" w:hAnsi="Calibri"/>
+          <w:rFonts w:ascii="Arial" w:hAnsi="Arial"/>
           <w:b/>
           <w:color w:val="16325C"/>
           <w:sz w:val="20"/>
@@ -854,246 +805,210 @@
     <w:p>
       <w:pPr>
         <w:pStyle w:val="ListBullet"/>
-        <w:spacing w:before="0" w:after="20" w:line="280" w:lineRule="exact"/>
+        <w:keepLines/>
+        <w:pageBreakBefore w:val="0"/>
+        <w:spacing w:before="0" w:after="20" w:line="247" w:lineRule="exact"/>
       </w:pPr>
       <w:r>
         <w:rPr>
-          <w:rFonts w:ascii="Calibri" w:hAnsi="Calibri"/>
+          <w:rFonts w:ascii="Arial" w:hAnsi="Arial"/>
           <w:color w:val="2B2B2B"/>
           <w:sz w:val="19"/>
         </w:rPr>
-        <w:t xml:space="preserve">Built Snowflake ETL pipelines with dbt across several client projects, using </w:t>
-      </w:r>
-      <w:r>
-        <w:rPr>
-          <w:rFonts w:ascii="Calibri" w:hAnsi="Calibri"/>
-          <w:b/>
-          <w:color w:val="2B2B2B"/>
-          <w:sz w:val="19"/>
-        </w:rPr>
-        <w:t>Data Vault</w:t>
-      </w:r>
-      <w:r>
-        <w:rPr>
-          <w:rFonts w:ascii="Calibri" w:hAnsi="Calibri"/>
-          <w:color w:val="2B2B2B"/>
-          <w:sz w:val="19"/>
-        </w:rPr>
-        <w:t xml:space="preserve"> or star schema depending on what each client needed for reporting.</w:t>
+        <w:t>Delivered Snowflake and dbt ETL solutions and wrote reusable SCD Type 1 and Type 2 macros, including tables with both column types.</w:t>
       </w:r>
     </w:p>
     <w:p>
       <w:pPr>
         <w:pStyle w:val="ListBullet"/>
-        <w:spacing w:before="0" w:after="20" w:line="280" w:lineRule="exact"/>
+        <w:keepLines/>
+        <w:pageBreakBefore w:val="0"/>
+        <w:spacing w:before="0" w:after="20" w:line="247" w:lineRule="exact"/>
       </w:pPr>
       <w:r>
         <w:rPr>
-          <w:rFonts w:ascii="Calibri" w:hAnsi="Calibri"/>
+          <w:rFonts w:ascii="Arial" w:hAnsi="Arial"/>
           <w:color w:val="2B2B2B"/>
           <w:sz w:val="19"/>
         </w:rPr>
-        <w:t xml:space="preserve">Wrote reusable macros for </w:t>
-      </w:r>
-      <w:r>
-        <w:rPr>
-          <w:rFonts w:ascii="Calibri" w:hAnsi="Calibri"/>
-          <w:b/>
-          <w:color w:val="2B2B2B"/>
-          <w:sz w:val="19"/>
-        </w:rPr>
-        <w:t>SCD Type 1 and Type 2</w:t>
-      </w:r>
-      <w:r>
-        <w:rPr>
-          <w:rFonts w:ascii="Calibri" w:hAnsi="Calibri"/>
-          <w:color w:val="2B2B2B"/>
-          <w:sz w:val="19"/>
-        </w:rPr>
-        <w:t xml:space="preserve"> across mixed column types, which removed per-table models and cut repeated code by around 60%.</w:t>
+        <w:t>Prototyped and implemented a client solution for null primary keys from late-arriving records on the right side of left joins.</w:t>
       </w:r>
     </w:p>
     <w:p>
       <w:pPr>
         <w:pStyle w:val="ListBullet"/>
-        <w:spacing w:before="0" w:after="20" w:line="280" w:lineRule="exact"/>
+        <w:keepLines/>
+        <w:pageBreakBefore w:val="0"/>
+        <w:spacing w:before="0" w:after="20" w:line="247" w:lineRule="exact"/>
       </w:pPr>
       <w:r>
         <w:rPr>
-          <w:rFonts w:ascii="Calibri" w:hAnsi="Calibri"/>
+          <w:rFonts w:ascii="Arial" w:hAnsi="Arial"/>
           <w:color w:val="2B2B2B"/>
           <w:sz w:val="19"/>
         </w:rPr>
-        <w:t>Tracked down a null primary key problem in left joins caused by late-arriving dimension records. Prototyped the fix, validated it with the client and put it into production.</w:t>
+        <w:t>Created and enhanced table, view, incremental and ephemeral models, plus snapshots; tested existing code during dbt upgrades.</w:t>
       </w:r>
     </w:p>
     <w:p>
       <w:pPr>
         <w:pStyle w:val="ListBullet"/>
-        <w:spacing w:before="0" w:after="20" w:line="280" w:lineRule="exact"/>
+        <w:keepLines/>
+        <w:pageBreakBefore w:val="0"/>
+        <w:spacing w:before="0" w:after="20" w:line="247" w:lineRule="exact"/>
       </w:pPr>
       <w:r>
         <w:rPr>
-          <w:rFonts w:ascii="Calibri" w:hAnsi="Calibri"/>
+          <w:rFonts w:ascii="Arial" w:hAnsi="Arial"/>
           <w:color w:val="2B2B2B"/>
           <w:sz w:val="19"/>
         </w:rPr>
-        <w:t>Worked with every dbt materialization (table, view, incremental, snapshot, ephemeral) and handled dbt version upgrades, testing impact before each one.</w:t>
+        <w:t>Added dbt tests for region filters and source-to-target row counts; managed code versions in Azure DevOps Git.</w:t>
       </w:r>
     </w:p>
     <w:p>
       <w:pPr>
         <w:pStyle w:val="ListBullet"/>
-        <w:spacing w:before="0" w:after="20" w:line="280" w:lineRule="exact"/>
+        <w:keepLines/>
+        <w:pageBreakBefore w:val="0"/>
+        <w:spacing w:before="0" w:after="20" w:line="247" w:lineRule="exact"/>
       </w:pPr>
       <w:r>
         <w:rPr>
-          <w:rFonts w:ascii="Calibri" w:hAnsi="Calibri"/>
+          <w:rFonts w:ascii="Arial" w:hAnsi="Arial"/>
           <w:color w:val="2B2B2B"/>
           <w:sz w:val="19"/>
         </w:rPr>
-        <w:t xml:space="preserve">Set up data quality testing with </w:t>
-      </w:r>
-      <w:r>
-        <w:rPr>
-          <w:rFonts w:ascii="Calibri" w:hAnsi="Calibri"/>
-          <w:b/>
-          <w:color w:val="2B2B2B"/>
-          <w:sz w:val="19"/>
-        </w:rPr>
-        <w:t>dbt-expectations</w:t>
-      </w:r>
-      <w:r>
-        <w:rPr>
-          <w:rFonts w:ascii="Calibri" w:hAnsi="Calibri"/>
-          <w:color w:val="2B2B2B"/>
-          <w:sz w:val="19"/>
-        </w:rPr>
-        <w:t>, getting 95%+ coverage on critical models with checks for region filtering, row count matching and nulls.</w:t>
+        <w:t>Implemented a process to rebuild historical changes and recover from data loss.</w:t>
       </w:r>
     </w:p>
     <w:p>
       <w:pPr>
         <w:pStyle w:val="ListBullet"/>
-        <w:spacing w:before="0" w:after="20" w:line="280" w:lineRule="exact"/>
+        <w:keepLines/>
+        <w:pageBreakBefore w:val="0"/>
+        <w:spacing w:before="0" w:after="20" w:line="247" w:lineRule="exact"/>
       </w:pPr>
       <w:r>
         <w:rPr>
-          <w:rFonts w:ascii="Calibri" w:hAnsi="Calibri"/>
+          <w:rFonts w:ascii="Arial" w:hAnsi="Arial"/>
           <w:color w:val="2B2B2B"/>
           <w:sz w:val="19"/>
         </w:rPr>
-        <w:t>Optimized complex SQL using CTEs, window functions and recursive queries. Overrode global dbt macros so full-refresh could switch between truncate-reload and drop-recreate at runtime.</w:t>
+        <w:t>Used SQL common table expressions (CTEs) to cleanse and transform data and create tables.</w:t>
       </w:r>
     </w:p>
     <w:p>
       <w:pPr>
         <w:pStyle w:val="ListBullet"/>
-        <w:spacing w:before="0" w:after="20" w:line="280" w:lineRule="exact"/>
+        <w:keepLines/>
+        <w:pageBreakBefore w:val="0"/>
+        <w:spacing w:before="0" w:after="20" w:line="247" w:lineRule="exact"/>
       </w:pPr>
       <w:r>
         <w:rPr>
-          <w:rFonts w:ascii="Calibri" w:hAnsi="Calibri"/>
+          <w:rFonts w:ascii="Arial" w:hAnsi="Arial"/>
           <w:color w:val="2B2B2B"/>
           <w:sz w:val="19"/>
         </w:rPr>
-        <w:t>Designed a recovery process to rebuild historical SCD data from raw sources when snapshots got corrupted, bringing recovery time down from days to under 4 hours.</w:t>
+        <w:t>Overrode global dbt macros to select drop/recreate or truncate/reload during full-refresh using a variable.</w:t>
       </w:r>
     </w:p>
     <w:p>
       <w:pPr>
         <w:pStyle w:val="ListBullet"/>
-        <w:spacing w:before="0" w:after="20" w:line="280" w:lineRule="exact"/>
+        <w:keepLines/>
+        <w:pageBreakBefore w:val="0"/>
+        <w:spacing w:before="0" w:after="20" w:line="247" w:lineRule="exact"/>
       </w:pPr>
       <w:r>
         <w:rPr>
-          <w:rFonts w:ascii="Calibri" w:hAnsi="Calibri"/>
+          <w:rFonts w:ascii="Arial" w:hAnsi="Arial"/>
           <w:color w:val="2B2B2B"/>
           <w:sz w:val="19"/>
         </w:rPr>
-        <w:t xml:space="preserve">Built an </w:t>
-      </w:r>
-      <w:r>
-        <w:rPr>
-          <w:rFonts w:ascii="Calibri" w:hAnsi="Calibri"/>
-          <w:b/>
-          <w:color w:val="2B2B2B"/>
-          <w:sz w:val="19"/>
-        </w:rPr>
-        <w:t>RBAC automation tool</w:t>
-      </w:r>
-      <w:r>
-        <w:rPr>
-          <w:rFonts w:ascii="Calibri" w:hAnsi="Calibri"/>
-          <w:color w:val="2B2B2B"/>
-          <w:sz w:val="19"/>
-        </w:rPr>
-        <w:t xml:space="preserve"> with PowerApps, Power Automate and Azure Functions, replacing manual SQL provisioning with a self-service form and cutting provisioning time by around 80%.</w:t>
+        <w:t>Automated Snowflake user and role creation with PowerApps, Power Automate and Azure Functions for internal Center of Excellence (COE) work.</w:t>
       </w:r>
     </w:p>
     <w:p>
       <w:pPr>
         <w:pStyle w:val="ListBullet"/>
-        <w:spacing w:before="0" w:after="20" w:line="280" w:lineRule="exact"/>
+        <w:keepLines/>
+        <w:pageBreakBefore w:val="0"/>
+        <w:spacing w:before="0" w:after="20" w:line="247" w:lineRule="exact"/>
       </w:pPr>
       <w:r>
         <w:rPr>
-          <w:rFonts w:ascii="Calibri" w:hAnsi="Calibri"/>
+          <w:rFonts w:ascii="Arial" w:hAnsi="Arial"/>
           <w:color w:val="2B2B2B"/>
           <w:sz w:val="19"/>
         </w:rPr>
-        <w:t>Built Power BI dashboards on warehouse credit usage, which let leadership spot 25%+ wasted compute and resize warehouses.</w:t>
+        <w:t>Produced a COE Power BI report for Snowflake warehouse usage recommendations.</w:t>
       </w:r>
     </w:p>
     <w:p>
       <w:pPr>
         <w:pStyle w:val="ListBullet"/>
-        <w:spacing w:before="0" w:after="20" w:line="280" w:lineRule="exact"/>
+        <w:keepLines/>
+        <w:pageBreakBefore w:val="0"/>
+        <w:spacing w:before="0" w:after="20" w:line="247" w:lineRule="exact"/>
       </w:pPr>
       <w:r>
         <w:rPr>
-          <w:rFonts w:ascii="Calibri" w:hAnsi="Calibri"/>
+          <w:rFonts w:ascii="Arial" w:hAnsi="Arial"/>
           <w:color w:val="2B2B2B"/>
           <w:sz w:val="19"/>
         </w:rPr>
-        <w:t>Owned the Git branching strategy in Azure DevOps for a dbt project of around 200 models.</w:t>
+        <w:t>Completed corporate ADF training and created an internal COE pipeline to ingest MSFT stock prices every minute and store each 5-minute high in Azure SQL.</w:t>
       </w:r>
     </w:p>
     <w:p>
       <w:pPr>
         <w:pStyle w:val="ListBullet"/>
-        <w:spacing w:before="0" w:after="20" w:line="280" w:lineRule="exact"/>
+        <w:keepLines/>
+        <w:pageBreakBefore w:val="0"/>
+        <w:spacing w:before="0" w:after="20" w:line="247" w:lineRule="exact"/>
       </w:pPr>
       <w:r>
         <w:rPr>
-          <w:rFonts w:ascii="Calibri" w:hAnsi="Calibri"/>
+          <w:rFonts w:ascii="Arial" w:hAnsi="Arial"/>
           <w:color w:val="2B2B2B"/>
           <w:sz w:val="19"/>
         </w:rPr>
-        <w:t>Streamed MSFT stock prices through ADF every minute and stored the high for each 5-minute window in Azure SQL, as part of internal COE work.</w:t>
+        <w:t>Used basic Python file handling for daily dbt tasks.</w:t>
       </w:r>
     </w:p>
     <w:p>
       <w:pPr>
+        <w:keepNext/>
         <w:spacing w:before="120" w:after="0"/>
       </w:pPr>
       <w:r>
         <w:rPr>
-          <w:rFonts w:ascii="Calibri" w:hAnsi="Calibri"/>
+          <w:rFonts w:ascii="Arial" w:hAnsi="Arial"/>
           <w:b/>
           <w:color w:val="111111"/>
           <w:sz w:val="21"/>
         </w:rPr>
-        <w:t>Software Engineer  |  March 2018 - May 2021</w:t>
+        <w:t>Software Engineer</w:t>
+      </w:r>
+      <w:r>
+        <w:rPr>
+          <w:rFonts w:ascii="Arial" w:hAnsi="Arial"/>
+          <w:color w:val="5A5A5A"/>
+          <w:sz w:val="18"/>
+        </w:rPr>
+        <w:t xml:space="preserve">  |  March 2018 - May 2021</w:t>
       </w:r>
     </w:p>
     <w:p>
       <w:pPr>
+        <w:keepNext/>
         <w:spacing w:before="0" w:after="40"/>
       </w:pPr>
       <w:r>
         <w:rPr>
-          <w:rFonts w:ascii="Calibri" w:hAnsi="Calibri"/>
+          <w:rFonts w:ascii="Arial" w:hAnsi="Arial"/>
           <w:b/>
           <w:color w:val="16325C"/>
           <w:sz w:val="20"/>
@@ -1104,154 +1019,140 @@
     <w:p>
       <w:pPr>
         <w:pStyle w:val="ListBullet"/>
-        <w:spacing w:before="0" w:after="20" w:line="280" w:lineRule="exact"/>
+        <w:keepLines/>
+        <w:pageBreakBefore w:val="0"/>
+        <w:spacing w:before="0" w:after="20" w:line="247" w:lineRule="exact"/>
       </w:pPr>
       <w:r>
         <w:rPr>
-          <w:rFonts w:ascii="Calibri" w:hAnsi="Calibri"/>
+          <w:rFonts w:ascii="Arial" w:hAnsi="Arial"/>
           <w:color w:val="2B2B2B"/>
           <w:sz w:val="19"/>
         </w:rPr>
-        <w:t>Built out the Snowflake data warehouse for the project and wrote the dbt and SQL transformation logic behind 50+ downstream reports.</w:t>
+        <w:t>Worked with Snowflake as part of data engineering work.</w:t>
       </w:r>
     </w:p>
     <w:p>
       <w:pPr>
         <w:pStyle w:val="ListBullet"/>
-        <w:spacing w:before="0" w:after="20" w:line="280" w:lineRule="exact"/>
+        <w:keepLines/>
+        <w:pageBreakBefore w:val="0"/>
+        <w:spacing w:before="0" w:after="20" w:line="247" w:lineRule="exact"/>
       </w:pPr>
       <w:r>
         <w:rPr>
-          <w:rFonts w:ascii="Calibri" w:hAnsi="Calibri"/>
+          <w:rFonts w:ascii="Arial" w:hAnsi="Arial"/>
           <w:color w:val="2B2B2B"/>
           <w:sz w:val="19"/>
         </w:rPr>
-        <w:t xml:space="preserve">Ran 15+ data pipelines on </w:t>
-      </w:r>
-      <w:r>
-        <w:rPr>
-          <w:rFonts w:ascii="Calibri" w:hAnsi="Calibri"/>
-          <w:b/>
-          <w:color w:val="2B2B2B"/>
-          <w:sz w:val="19"/>
-        </w:rPr>
-        <w:t>SAP BW</w:t>
-      </w:r>
-      <w:r>
-        <w:rPr>
-          <w:rFonts w:ascii="Calibri" w:hAnsi="Calibri"/>
-          <w:color w:val="2B2B2B"/>
-          <w:sz w:val="19"/>
-        </w:rPr>
-        <w:t xml:space="preserve"> (ADSOs, DSOs, Composite Providers) and automated scheduling with Process Chains, cutting manual data prep by around 30%.</w:t>
+        <w:t>Implemented SAP BW data cleansing using ADSOs, DSOs and Composite Providers.</w:t>
       </w:r>
     </w:p>
     <w:p>
       <w:pPr>
         <w:pStyle w:val="ListBullet"/>
-        <w:spacing w:before="0" w:after="20" w:line="280" w:lineRule="exact"/>
+        <w:keepLines/>
+        <w:pageBreakBefore w:val="0"/>
+        <w:spacing w:before="0" w:after="20" w:line="247" w:lineRule="exact"/>
       </w:pPr>
       <w:r>
         <w:rPr>
-          <w:rFonts w:ascii="Calibri" w:hAnsi="Calibri"/>
+          <w:rFonts w:ascii="Arial" w:hAnsi="Arial"/>
           <w:color w:val="2B2B2B"/>
           <w:sz w:val="19"/>
         </w:rPr>
-        <w:t xml:space="preserve">Moved legacy reports to </w:t>
-      </w:r>
-      <w:r>
-        <w:rPr>
-          <w:rFonts w:ascii="Calibri" w:hAnsi="Calibri"/>
-          <w:b/>
-          <w:color w:val="2B2B2B"/>
-          <w:sz w:val="19"/>
-        </w:rPr>
-        <w:t>SAP HANA</w:t>
-      </w:r>
-      <w:r>
-        <w:rPr>
-          <w:rFonts w:ascii="Calibri" w:hAnsi="Calibri"/>
-          <w:color w:val="2B2B2B"/>
-          <w:sz w:val="19"/>
-        </w:rPr>
-        <w:t xml:space="preserve"> calculation views, which ran around 40% faster than the BW versions.</w:t>
+        <w:t>Created calculation views for complex data processing requirements.</w:t>
       </w:r>
     </w:p>
     <w:p>
       <w:pPr>
         <w:pStyle w:val="ListBullet"/>
-        <w:spacing w:before="0" w:after="20" w:line="280" w:lineRule="exact"/>
+        <w:keepLines/>
+        <w:pageBreakBefore w:val="0"/>
+        <w:spacing w:before="0" w:after="20" w:line="247" w:lineRule="exact"/>
       </w:pPr>
       <w:r>
         <w:rPr>
-          <w:rFonts w:ascii="Calibri" w:hAnsi="Calibri"/>
+          <w:rFonts w:ascii="Arial" w:hAnsi="Arial"/>
           <w:color w:val="2B2B2B"/>
           <w:sz w:val="19"/>
         </w:rPr>
-        <w:t>Built Power BI dashboards with DAX and M Query for 3 business units, replacing weekly Excel reporting.</w:t>
+        <w:t>Developed and updated Power BI dashboards.</w:t>
       </w:r>
     </w:p>
     <w:p>
       <w:pPr>
         <w:pStyle w:val="ListBullet"/>
-        <w:spacing w:before="0" w:after="20" w:line="280" w:lineRule="exact"/>
+        <w:keepLines/>
+        <w:pageBreakBefore w:val="0"/>
+        <w:spacing w:before="0" w:after="20" w:line="247" w:lineRule="exact"/>
       </w:pPr>
       <w:r>
         <w:rPr>
-          <w:rFonts w:ascii="Calibri" w:hAnsi="Calibri"/>
+          <w:rFonts w:ascii="Arial" w:hAnsi="Arial"/>
           <w:color w:val="2B2B2B"/>
           <w:sz w:val="19"/>
         </w:rPr>
-        <w:t>Owned deployments across dev, QA and production. Kept 99%+ on-time delivery by watching Process Chains and fixing failures before they escalated.</w:t>
+        <w:t>Used M Query for data preparation, complex calculations and joins.</w:t>
       </w:r>
     </w:p>
     <w:p>
       <w:pPr>
         <w:pStyle w:val="ListBullet"/>
-        <w:spacing w:before="0" w:after="20" w:line="280" w:lineRule="exact"/>
+        <w:keepLines/>
+        <w:pageBreakBefore w:val="0"/>
+        <w:spacing w:before="0" w:after="20" w:line="247" w:lineRule="exact"/>
       </w:pPr>
       <w:r>
         <w:rPr>
-          <w:rFonts w:ascii="Calibri" w:hAnsi="Calibri"/>
+          <w:rFonts w:ascii="Arial" w:hAnsi="Arial"/>
           <w:color w:val="2B2B2B"/>
           <w:sz w:val="19"/>
         </w:rPr>
-        <w:t>Wrote data cleansing scripts to standardize 10+ source tables with inconsistent formats, which cut downstream transformation failures.</w:t>
+        <w:t>Wrote DAX calculations for Power BI reports.</w:t>
       </w:r>
     </w:p>
     <w:p>
       <w:pPr>
         <w:pStyle w:val="ListBullet"/>
-        <w:spacing w:before="0" w:after="20" w:line="280" w:lineRule="exact"/>
+        <w:keepLines/>
+        <w:pageBreakBefore w:val="0"/>
+        <w:spacing w:before="0" w:after="20" w:line="247" w:lineRule="exact"/>
       </w:pPr>
       <w:r>
         <w:rPr>
-          <w:rFonts w:ascii="Calibri" w:hAnsi="Calibri"/>
+          <w:rFonts w:ascii="Arial" w:hAnsi="Arial"/>
           <w:color w:val="2B2B2B"/>
           <w:sz w:val="19"/>
         </w:rPr>
-        <w:t>Coordinated transport management across all 3 environments, working with other teams to hit release windows.</w:t>
+        <w:t>Automated data processing with SAP BW Process Chains and monitored their execution.</w:t>
       </w:r>
     </w:p>
     <w:p>
       <w:pPr>
-        <w:spacing w:before="80" w:after="80"/>
+        <w:pStyle w:val="ListBullet"/>
+        <w:keepLines/>
+        <w:pageBreakBefore w:val="0"/>
+        <w:spacing w:before="0" w:after="20" w:line="247" w:lineRule="exact"/>
       </w:pPr>
       <w:r>
         <w:rPr>
-          <w:color w:val="CFCFCF"/>
-          <w:sz w:val="12"/>
+          <w:rFonts w:ascii="Arial" w:hAnsi="Arial"/>
+          <w:color w:val="2B2B2B"/>
+          <w:sz w:val="19"/>
         </w:rPr>
-        <w:t>────────────────────────────────────────────────────────────────────────────────</w:t>
+        <w:t>Transported data flows to production using change requests and transport requests.</w:t>
       </w:r>
     </w:p>
     <w:p>
       <w:pPr>
-        <w:spacing w:before="40" w:after="80"/>
+        <w:pStyle w:val="Heading1"/>
+        <w:keepNext/>
+        <w:spacing w:before="160" w:after="80" w:line="280" w:lineRule="exact"/>
       </w:pPr>
       <w:r>
         <w:rPr>
-          <w:rFonts w:ascii="Calibri" w:hAnsi="Calibri"/>
+          <w:rFonts w:ascii="Arial" w:hAnsi="Arial"/>
           <w:b/>
           <w:color w:val="16325C"/>
           <w:sz w:val="22"/>
@@ -1262,12 +1163,12 @@
     <w:p>
       <w:pPr>
         <w:pStyle w:val="ListBullet"/>
-        <w:spacing w:before="0" w:after="20" w:line="280" w:lineRule="exact"/>
+        <w:keepLines/>
+        <w:spacing w:before="0" w:after="20" w:line="247" w:lineRule="exact"/>
       </w:pPr>
       <w:r>
         <w:rPr>
-          <w:rFonts w:ascii="Calibri" w:hAnsi="Calibri"/>
-          <w:b/>
+          <w:rFonts w:ascii="Arial" w:hAnsi="Arial"/>
           <w:color w:val="111111"/>
           <w:sz w:val="19"/>
         </w:rPr>
@@ -1275,7 +1176,7 @@
       </w:r>
       <w:r>
         <w:rPr>
-          <w:rFonts w:ascii="Calibri" w:hAnsi="Calibri"/>
+          <w:rFonts w:ascii="Arial" w:hAnsi="Arial"/>
           <w:color w:val="2B2B2B"/>
           <w:sz w:val="19"/>
         </w:rPr>
@@ -1285,12 +1186,12 @@
     <w:p>
       <w:pPr>
         <w:pStyle w:val="ListBullet"/>
-        <w:spacing w:before="0" w:after="20" w:line="280" w:lineRule="exact"/>
+        <w:keepLines/>
+        <w:spacing w:before="0" w:after="20" w:line="247" w:lineRule="exact"/>
       </w:pPr>
       <w:r>
         <w:rPr>
-          <w:rFonts w:ascii="Calibri" w:hAnsi="Calibri"/>
-          <w:b/>
+          <w:rFonts w:ascii="Arial" w:hAnsi="Arial"/>
           <w:color w:val="111111"/>
           <w:sz w:val="19"/>
         </w:rPr>
@@ -1298,7 +1199,7 @@
       </w:r>
       <w:r>
         <w:rPr>
-          <w:rFonts w:ascii="Calibri" w:hAnsi="Calibri"/>
+          <w:rFonts w:ascii="Arial" w:hAnsi="Arial"/>
           <w:color w:val="2B2B2B"/>
           <w:sz w:val="19"/>
         </w:rPr>
@@ -1308,12 +1209,12 @@
     <w:p>
       <w:pPr>
         <w:pStyle w:val="ListBullet"/>
-        <w:spacing w:before="0" w:after="20" w:line="280" w:lineRule="exact"/>
+        <w:keepLines/>
+        <w:spacing w:before="0" w:after="20" w:line="247" w:lineRule="exact"/>
       </w:pPr>
       <w:r>
         <w:rPr>
-          <w:rFonts w:ascii="Calibri" w:hAnsi="Calibri"/>
-          <w:b/>
+          <w:rFonts w:ascii="Arial" w:hAnsi="Arial"/>
           <w:color w:val="111111"/>
           <w:sz w:val="19"/>
         </w:rPr>
@@ -1321,7 +1222,7 @@
       </w:r>
       <w:r>
         <w:rPr>
-          <w:rFonts w:ascii="Calibri" w:hAnsi="Calibri"/>
+          <w:rFonts w:ascii="Arial" w:hAnsi="Arial"/>
           <w:color w:val="2B2B2B"/>
           <w:sz w:val="19"/>
         </w:rPr>
@@ -1331,12 +1232,12 @@
     <w:p>
       <w:pPr>
         <w:pStyle w:val="ListBullet"/>
-        <w:spacing w:before="0" w:after="20" w:line="280" w:lineRule="exact"/>
+        <w:keepLines/>
+        <w:spacing w:before="0" w:after="20" w:line="247" w:lineRule="exact"/>
       </w:pPr>
       <w:r>
         <w:rPr>
-          <w:rFonts w:ascii="Calibri" w:hAnsi="Calibri"/>
-          <w:b/>
+          <w:rFonts w:ascii="Arial" w:hAnsi="Arial"/>
           <w:color w:val="111111"/>
           <w:sz w:val="19"/>
         </w:rPr>
@@ -1344,7 +1245,7 @@
       </w:r>
       <w:r>
         <w:rPr>
-          <w:rFonts w:ascii="Calibri" w:hAnsi="Calibri"/>
+          <w:rFonts w:ascii="Arial" w:hAnsi="Arial"/>
           <w:color w:val="2B2B2B"/>
           <w:sz w:val="19"/>
         </w:rPr>
@@ -1354,12 +1255,12 @@
     <w:p>
       <w:pPr>
         <w:pStyle w:val="ListBullet"/>
-        <w:spacing w:before="0" w:after="20" w:line="280" w:lineRule="exact"/>
+        <w:keepLines/>
+        <w:spacing w:before="0" w:after="20" w:line="247" w:lineRule="exact"/>
       </w:pPr>
       <w:r>
         <w:rPr>
-          <w:rFonts w:ascii="Calibri" w:hAnsi="Calibri"/>
-          <w:b/>
+          <w:rFonts w:ascii="Arial" w:hAnsi="Arial"/>
           <w:color w:val="111111"/>
           <w:sz w:val="19"/>
         </w:rPr>
@@ -1367,7 +1268,7 @@
       </w:r>
       <w:r>
         <w:rPr>
-          <w:rFonts w:ascii="Calibri" w:hAnsi="Calibri"/>
+          <w:rFonts w:ascii="Arial" w:hAnsi="Arial"/>
           <w:color w:val="2B2B2B"/>
           <w:sz w:val="19"/>
         </w:rPr>
@@ -1377,12 +1278,12 @@
     <w:p>
       <w:pPr>
         <w:pStyle w:val="ListBullet"/>
-        <w:spacing w:before="0" w:after="20" w:line="280" w:lineRule="exact"/>
+        <w:keepLines/>
+        <w:spacing w:before="0" w:after="20" w:line="247" w:lineRule="exact"/>
       </w:pPr>
       <w:r>
         <w:rPr>
-          <w:rFonts w:ascii="Calibri" w:hAnsi="Calibri"/>
-          <w:b/>
+          <w:rFonts w:ascii="Arial" w:hAnsi="Arial"/>
           <w:color w:val="111111"/>
           <w:sz w:val="19"/>
         </w:rPr>
@@ -1390,7 +1291,7 @@
       </w:r>
       <w:r>
         <w:rPr>
-          <w:rFonts w:ascii="Calibri" w:hAnsi="Calibri"/>
+          <w:rFonts w:ascii="Arial" w:hAnsi="Arial"/>
           <w:color w:val="2B2B2B"/>
           <w:sz w:val="19"/>
         </w:rPr>
@@ -1400,12 +1301,12 @@
     <w:p>
       <w:pPr>
         <w:pStyle w:val="ListBullet"/>
-        <w:spacing w:before="0" w:after="20" w:line="280" w:lineRule="exact"/>
+        <w:keepLines/>
+        <w:spacing w:before="0" w:after="20" w:line="247" w:lineRule="exact"/>
       </w:pPr>
       <w:r>
         <w:rPr>
-          <w:rFonts w:ascii="Calibri" w:hAnsi="Calibri"/>
-          <w:b/>
+          <w:rFonts w:ascii="Arial" w:hAnsi="Arial"/>
           <w:color w:val="111111"/>
           <w:sz w:val="19"/>
         </w:rPr>
@@ -1413,7 +1314,7 @@
       </w:r>
       <w:r>
         <w:rPr>
-          <w:rFonts w:ascii="Calibri" w:hAnsi="Calibri"/>
+          <w:rFonts w:ascii="Arial" w:hAnsi="Arial"/>
           <w:color w:val="2B2B2B"/>
           <w:sz w:val="19"/>
         </w:rPr>
@@ -1423,12 +1324,12 @@
     <w:p>
       <w:pPr>
         <w:pStyle w:val="ListBullet"/>
-        <w:spacing w:before="0" w:after="20" w:line="280" w:lineRule="exact"/>
+        <w:keepLines/>
+        <w:spacing w:before="0" w:after="20" w:line="247" w:lineRule="exact"/>
       </w:pPr>
       <w:r>
         <w:rPr>
-          <w:rFonts w:ascii="Calibri" w:hAnsi="Calibri"/>
-          <w:b/>
+          <w:rFonts w:ascii="Arial" w:hAnsi="Arial"/>
           <w:color w:val="111111"/>
           <w:sz w:val="19"/>
         </w:rPr>
@@ -1436,7 +1337,7 @@
       </w:r>
       <w:r>
         <w:rPr>
-          <w:rFonts w:ascii="Calibri" w:hAnsi="Calibri"/>
+          <w:rFonts w:ascii="Arial" w:hAnsi="Arial"/>
           <w:color w:val="2B2B2B"/>
           <w:sz w:val="19"/>
         </w:rPr>
@@ -1445,23 +1346,13 @@
     </w:p>
     <w:p>
       <w:pPr>
-        <w:spacing w:before="80" w:after="80"/>
+        <w:pStyle w:val="Heading1"/>
+        <w:keepNext/>
+        <w:spacing w:before="160" w:after="80" w:line="280" w:lineRule="exact"/>
       </w:pPr>
       <w:r>
         <w:rPr>
-          <w:color w:val="CFCFCF"/>
-          <w:sz w:val="12"/>
-        </w:rPr>
-        <w:t>────────────────────────────────────────────────────────────────────────────────</w:t>
-      </w:r>
-    </w:p>
-    <w:p>
-      <w:pPr>
-        <w:spacing w:before="40" w:after="80"/>
-      </w:pPr>
-      <w:r>
-        <w:rPr>
-          <w:rFonts w:ascii="Calibri" w:hAnsi="Calibri"/>
+          <w:rFonts w:ascii="Arial" w:hAnsi="Arial"/>
           <w:b/>
           <w:color w:val="16325C"/>
           <w:sz w:val="22"/>
@@ -1471,20 +1362,20 @@
     </w:p>
     <w:p>
       <w:pPr>
-        <w:spacing w:before="0" w:after="40" w:line="280" w:lineRule="exact"/>
+        <w:spacing w:before="0" w:after="40" w:line="247" w:lineRule="exact"/>
       </w:pPr>
       <w:r>
         <w:rPr>
-          <w:rFonts w:ascii="Calibri" w:hAnsi="Calibri"/>
+          <w:rFonts w:ascii="Arial" w:hAnsi="Arial"/>
           <w:b/>
           <w:color w:val="111111"/>
           <w:sz w:val="19"/>
         </w:rPr>
-        <w:t>B. Tech</w:t>
+        <w:t>Bachelor of Technology (B.Tech)</w:t>
       </w:r>
       <w:r>
         <w:rPr>
-          <w:rFonts w:ascii="Calibri" w:hAnsi="Calibri"/>
+          <w:rFonts w:ascii="Arial" w:hAnsi="Arial"/>
           <w:color w:val="2B2B2B"/>
           <w:sz w:val="19"/>
         </w:rPr>
@@ -1493,67 +1384,13 @@
     </w:p>
     <w:p>
       <w:pPr>
-        <w:spacing w:before="0" w:after="40" w:line="280" w:lineRule="exact"/>
+        <w:pStyle w:val="Heading1"/>
+        <w:keepNext/>
+        <w:spacing w:before="160" w:after="80" w:line="280" w:lineRule="exact"/>
       </w:pPr>
       <w:r>
         <w:rPr>
-          <w:rFonts w:ascii="Calibri" w:hAnsi="Calibri"/>
-          <w:b/>
-          <w:color w:val="111111"/>
-          <w:sz w:val="19"/>
-        </w:rPr>
-        <w:t>Higher Secondary</w:t>
-      </w:r>
-      <w:r>
-        <w:rPr>
-          <w:rFonts w:ascii="Calibri" w:hAnsi="Calibri"/>
-          <w:color w:val="2B2B2B"/>
-          <w:sz w:val="19"/>
-        </w:rPr>
-        <w:t xml:space="preserve"> – DAV Higher Secondary School, Asansol, West Bengal | 2011-2013 | 76%</w:t>
-      </w:r>
-    </w:p>
-    <w:p>
-      <w:pPr>
-        <w:spacing w:before="0" w:after="40" w:line="280" w:lineRule="exact"/>
-      </w:pPr>
-      <w:r>
-        <w:rPr>
-          <w:rFonts w:ascii="Calibri" w:hAnsi="Calibri"/>
-          <w:b/>
-          <w:color w:val="111111"/>
-          <w:sz w:val="19"/>
-        </w:rPr>
-        <w:t>Madhyamik (Class 10)</w:t>
-      </w:r>
-      <w:r>
-        <w:rPr>
-          <w:rFonts w:ascii="Calibri" w:hAnsi="Calibri"/>
-          <w:color w:val="2B2B2B"/>
-          <w:sz w:val="19"/>
-        </w:rPr>
-        <w:t xml:space="preserve"> – DAV Higher Secondary School, Asansol, West Bengal | 2011 | 76%</w:t>
-      </w:r>
-    </w:p>
-    <w:p>
-      <w:pPr>
-        <w:spacing w:before="80" w:after="80"/>
-      </w:pPr>
-      <w:r>
-        <w:rPr>
-          <w:color w:val="CFCFCF"/>
-          <w:sz w:val="12"/>
-        </w:rPr>
-        <w:t>────────────────────────────────────────────────────────────────────────────────</w:t>
-      </w:r>
-    </w:p>
-    <w:p>
-      <w:pPr>
-        <w:spacing w:before="40" w:after="80"/>
-      </w:pPr>
-      <w:r>
-        <w:rPr>
-          <w:rFonts w:ascii="Calibri" w:hAnsi="Calibri"/>
+          <w:rFonts w:ascii="Arial" w:hAnsi="Arial"/>
           <w:b/>
           <w:color w:val="16325C"/>
           <w:sz w:val="22"/>
@@ -1564,151 +1401,42 @@
     <w:p>
       <w:pPr>
         <w:pStyle w:val="ListBullet"/>
-        <w:spacing w:before="0" w:after="20" w:line="280" w:lineRule="exact"/>
+        <w:keepLines/>
+        <w:spacing w:before="0" w:after="20" w:line="247" w:lineRule="exact"/>
       </w:pPr>
       <w:r>
         <w:rPr>
-          <w:rFonts w:ascii="Calibri" w:hAnsi="Calibri"/>
-          <w:b/>
+          <w:rFonts w:ascii="Arial" w:hAnsi="Arial"/>
           <w:color w:val="2B2B2B"/>
           <w:sz w:val="19"/>
         </w:rPr>
-        <w:t>Star Performer Award (2x)</w:t>
-      </w:r>
-      <w:r>
-        <w:rPr>
-          <w:rFonts w:ascii="Calibri" w:hAnsi="Calibri"/>
-          <w:color w:val="2B2B2B"/>
-          <w:sz w:val="19"/>
-        </w:rPr>
-        <w:t xml:space="preserve"> for client solution delivery</w:t>
+        <w:t>Star Performer Award (2x), Pinnacle Award and PAT ON BACK Award for client delivery.</w:t>
       </w:r>
     </w:p>
     <w:p>
       <w:pPr>
         <w:pStyle w:val="ListBullet"/>
-        <w:spacing w:before="0" w:after="20" w:line="280" w:lineRule="exact"/>
+        <w:keepLines/>
+        <w:spacing w:before="0" w:after="20" w:line="247" w:lineRule="exact"/>
       </w:pPr>
       <w:r>
         <w:rPr>
-          <w:rFonts w:ascii="Calibri" w:hAnsi="Calibri"/>
-          <w:b/>
+          <w:rFonts w:ascii="Arial" w:hAnsi="Arial"/>
           <w:color w:val="2B2B2B"/>
           <w:sz w:val="19"/>
         </w:rPr>
-        <w:t>Pinnacle Award</w:t>
-      </w:r>
-      <w:r>
-        <w:rPr>
-          <w:rFonts w:ascii="Calibri" w:hAnsi="Calibri"/>
-          <w:color w:val="2B2B2B"/>
-          <w:sz w:val="19"/>
-        </w:rPr>
-        <w:t xml:space="preserve"> for on-time delivery and positive client feedback</w:t>
+        <w:t>Ninja Squad (2x) and Eagle Squad recognition for technical problem-solving and team delivery; multiple client commendations for leadership.</w:t>
       </w:r>
     </w:p>
     <w:p>
       <w:pPr>
-        <w:pStyle w:val="ListBullet"/>
-        <w:spacing w:before="0" w:after="20" w:line="280" w:lineRule="exact"/>
+        <w:pStyle w:val="Heading1"/>
+        <w:keepNext/>
+        <w:spacing w:before="160" w:after="80" w:line="280" w:lineRule="exact"/>
       </w:pPr>
       <w:r>
         <w:rPr>
-          <w:rFonts w:ascii="Calibri" w:hAnsi="Calibri"/>
-          <w:b/>
-          <w:color w:val="2B2B2B"/>
-          <w:sz w:val="19"/>
-        </w:rPr>
-        <w:t>PAT ON BACK Award</w:t>
-      </w:r>
-      <w:r>
-        <w:rPr>
-          <w:rFonts w:ascii="Calibri" w:hAnsi="Calibri"/>
-          <w:color w:val="2B2B2B"/>
-          <w:sz w:val="19"/>
-        </w:rPr>
-        <w:t xml:space="preserve"> for going above and beyond on project deadlines</w:t>
-      </w:r>
-    </w:p>
-    <w:p>
-      <w:pPr>
-        <w:pStyle w:val="ListBullet"/>
-        <w:spacing w:before="0" w:after="20" w:line="280" w:lineRule="exact"/>
-      </w:pPr>
-      <w:r>
-        <w:rPr>
-          <w:rFonts w:ascii="Calibri" w:hAnsi="Calibri"/>
-          <w:b/>
-          <w:color w:val="2B2B2B"/>
-          <w:sz w:val="19"/>
-        </w:rPr>
-        <w:t>Ninja Squad (2x)</w:t>
-      </w:r>
-      <w:r>
-        <w:rPr>
-          <w:rFonts w:ascii="Calibri" w:hAnsi="Calibri"/>
-          <w:color w:val="2B2B2B"/>
-          <w:sz w:val="19"/>
-        </w:rPr>
-        <w:t xml:space="preserve"> for technical problem-solving</w:t>
-      </w:r>
-    </w:p>
-    <w:p>
-      <w:pPr>
-        <w:pStyle w:val="ListBullet"/>
-        <w:spacing w:before="0" w:after="20" w:line="280" w:lineRule="exact"/>
-      </w:pPr>
-      <w:r>
-        <w:rPr>
-          <w:rFonts w:ascii="Calibri" w:hAnsi="Calibri"/>
-          <w:b/>
-          <w:color w:val="2B2B2B"/>
-          <w:sz w:val="19"/>
-        </w:rPr>
-        <w:t>Eagle Squad</w:t>
-      </w:r>
-      <w:r>
-        <w:rPr>
-          <w:rFonts w:ascii="Calibri" w:hAnsi="Calibri"/>
-          <w:color w:val="2B2B2B"/>
-          <w:sz w:val="19"/>
-        </w:rPr>
-        <w:t xml:space="preserve"> for consistent team delivery</w:t>
-      </w:r>
-    </w:p>
-    <w:p>
-      <w:pPr>
-        <w:pStyle w:val="ListBullet"/>
-        <w:spacing w:before="0" w:after="20" w:line="280" w:lineRule="exact"/>
-      </w:pPr>
-      <w:r>
-        <w:rPr>
-          <w:rFonts w:ascii="Calibri" w:hAnsi="Calibri"/>
-          <w:color w:val="2B2B2B"/>
-          <w:sz w:val="19"/>
-        </w:rPr>
-        <w:t>Multiple client commendations for hands-on leadership</w:t>
-      </w:r>
-    </w:p>
-    <w:p>
-      <w:pPr>
-        <w:spacing w:before="80" w:after="80"/>
-      </w:pPr>
-      <w:r>
-        <w:rPr>
-          <w:color w:val="CFCFCF"/>
-          <w:sz w:val="12"/>
-        </w:rPr>
-        <w:t>────────────────────────────────────────────────────────────────────────────────</w:t>
-      </w:r>
-    </w:p>
-    <w:p>
-      <w:pPr>
-        <w:spacing w:before="40" w:after="80"/>
-      </w:pPr>
-      <w:r>
-        <w:rPr>
-          <w:rFonts w:ascii="Calibri" w:hAnsi="Calibri"/>
+          <w:rFonts w:ascii="Arial" w:hAnsi="Arial"/>
           <w:b/>
           <w:color w:val="16325C"/>
           <w:sz w:val="22"/>
@@ -1722,7 +1450,7 @@
       </w:pPr>
       <w:r>
         <w:rPr>
-          <w:rFonts w:ascii="Calibri" w:hAnsi="Calibri"/>
+          <w:rFonts w:ascii="Arial" w:hAnsi="Arial"/>
           <w:color w:val="2B2B2B"/>
           <w:sz w:val="19"/>
         </w:rPr>
@@ -1730,8 +1458,8 @@
       </w:r>
     </w:p>
     <w:sectPr>
-      <w:pgSz w:w="12240" w:h="15840"/>
-      <w:pgMar w:top="720" w:right="864" w:bottom="720" w:left="864" w:header="720" w:footer="720" w:gutter="0"/>
+      <w:pgSz w:w="11906" w:h="16838"/>
+      <w:pgMar w:top="567" w:right="680" w:bottom="567" w:left="680" w:header="720" w:footer="720" w:gutter="0"/>
       <w:cols w:space="720"/>
       <w:docGrid w:linePitch="360"/>
     </w:sectPr>
@@ -2102,6 +1830,13 @@
     <w:name w:val="Normal"/>
     <w:qFormat/>
     <w:rsid w:val="00FC693F"/>
+    <w:pPr>
+      <w:spacing w:line="247" w:lineRule="exact" w:after="0"/>
+    </w:pPr>
+    <w:rPr>
+      <w:rFonts w:ascii="Arial" w:hAnsi="Arial"/>
+      <w:sz w:val="19"/>
+    </w:rPr>
   </w:style>
   <w:style w:type="paragraph" w:styleId="Header">
     <w:name w:val="header"/>
@@ -2444,9 +2179,6 @@
     <w:qFormat/>
     <w:rsid w:val="00FC693F"/>
     <w:pPr>
-      <w:pBdr>
-        <w:bottom w:val="single" w:sz="8" w:space="4" w:color="4F81BD" w:themeColor="accent1"/>
-      </w:pBdr>
       <w:spacing w:after="300" w:line="240" w:lineRule="auto"/>
       <w:contextualSpacing/>
     </w:pPr>

</xml_diff>